<commit_message>
fix loi update danh muc
</commit_message>
<xml_diff>
--- a/181213396_VuDuyLong_CNTT3_K59.docx
+++ b/181213396_VuDuyLong_CNTT3_K59.docx
@@ -1,6 +1,6 @@
 
 <file path=word/document.xml><?xml version="1.0" encoding="utf-8"?>
-<w:document xmlns:wpc="http://schemas.microsoft.com/office/word/2010/wordprocessingCanvas" xmlns:cx="http://schemas.microsoft.com/office/drawing/2014/chartex" xmlns:mc="http://schemas.openxmlformats.org/markup-compatibility/2006" xmlns:o="urn:schemas-microsoft-com:office:office" xmlns:r="http://schemas.openxmlformats.org/officeDocument/2006/relationships" xmlns:m="http://schemas.openxmlformats.org/officeDocument/2006/math" xmlns:v="urn:schemas-microsoft-com:vml" xmlns:wp14="http://schemas.microsoft.com/office/word/2010/wordprocessingDrawing" xmlns:wp="http://schemas.openxmlformats.org/drawingml/2006/wordprocessingDrawing" xmlns:w10="urn:schemas-microsoft-com:office:word" xmlns:w="http://schemas.openxmlformats.org/wordprocessingml/2006/main" xmlns:w14="http://schemas.microsoft.com/office/word/2010/wordml" xmlns:w15="http://schemas.microsoft.com/office/word/2012/wordml" xmlns:w16se="http://schemas.microsoft.com/office/word/2015/wordml/symex" xmlns:wpg="http://schemas.microsoft.com/office/word/2010/wordprocessingGroup" xmlns:wpi="http://schemas.microsoft.com/office/word/2010/wordprocessingInk" xmlns:wne="http://schemas.microsoft.com/office/word/2006/wordml" xmlns:wps="http://schemas.microsoft.com/office/word/2010/wordprocessingShape" mc:Ignorable="w14 w15 w16se wp14">
+<w:document xmlns:wpc="http://schemas.microsoft.com/office/word/2010/wordprocessingCanvas" xmlns:cx="http://schemas.microsoft.com/office/drawing/2014/chartex" xmlns:cx1="http://schemas.microsoft.com/office/drawing/2015/9/8/chartex" xmlns:cx2="http://schemas.microsoft.com/office/drawing/2015/10/21/chartex" xmlns:cx3="http://schemas.microsoft.com/office/drawing/2016/5/9/chartex" xmlns:cx4="http://schemas.microsoft.com/office/drawing/2016/5/10/chartex" xmlns:cx5="http://schemas.microsoft.com/office/drawing/2016/5/11/chartex" xmlns:cx6="http://schemas.microsoft.com/office/drawing/2016/5/12/chartex" xmlns:cx7="http://schemas.microsoft.com/office/drawing/2016/5/13/chartex" xmlns:cx8="http://schemas.microsoft.com/office/drawing/2016/5/14/chartex" xmlns:mc="http://schemas.openxmlformats.org/markup-compatibility/2006" xmlns:aink="http://schemas.microsoft.com/office/drawing/2016/ink" xmlns:am3d="http://schemas.microsoft.com/office/drawing/2017/model3d" xmlns:o="urn:schemas-microsoft-com:office:office" xmlns:r="http://schemas.openxmlformats.org/officeDocument/2006/relationships" xmlns:m="http://schemas.openxmlformats.org/officeDocument/2006/math" xmlns:v="urn:schemas-microsoft-com:vml" xmlns:wp14="http://schemas.microsoft.com/office/word/2010/wordprocessingDrawing" xmlns:wp="http://schemas.openxmlformats.org/drawingml/2006/wordprocessingDrawing" xmlns:w10="urn:schemas-microsoft-com:office:word" xmlns:w="http://schemas.openxmlformats.org/wordprocessingml/2006/main" xmlns:w14="http://schemas.microsoft.com/office/word/2010/wordml" xmlns:w15="http://schemas.microsoft.com/office/word/2012/wordml" xmlns:w16cex="http://schemas.microsoft.com/office/word/2018/wordml/cex" xmlns:w16cid="http://schemas.microsoft.com/office/word/2016/wordml/cid" xmlns:w16="http://schemas.microsoft.com/office/word/2018/wordml" xmlns:w16se="http://schemas.microsoft.com/office/word/2015/wordml/symex" xmlns:wpg="http://schemas.microsoft.com/office/word/2010/wordprocessingGroup" xmlns:wpi="http://schemas.microsoft.com/office/word/2010/wordprocessingInk" xmlns:wne="http://schemas.microsoft.com/office/word/2006/wordml" xmlns:wps="http://schemas.microsoft.com/office/word/2010/wordprocessingShape" mc:Ignorable="w14 w15 w16se w16cid w16 w16cex wp14">
   <w:body>
     <w:tbl>
       <w:tblPr>
@@ -89,7 +89,7 @@
               <w:rPr>
                 <w:noProof/>
               </w:rPr>
-              <w:pict>
+              <w:pict w14:anchorId="6BD4CAD0">
                 <v:line id="Straight Connector 1" o:spid="_x0000_s1234" style="position:absolute;left:0;text-align:left;z-index:487637504;visibility:visible;mso-wrap-style:square;mso-width-percent:0;mso-height-percent:0;mso-wrap-distance-left:9pt;mso-wrap-distance-top:0;mso-wrap-distance-right:9pt;mso-wrap-distance-bottom:0;mso-position-horizontal:absolute;mso-position-horizontal-relative:text;mso-position-vertical:absolute;mso-position-vertical-relative:text;mso-width-percent:0;mso-height-percent:0;mso-width-relative:page;mso-height-relative:page" from="154.4pt,9.35pt" to="287.4pt,9.35pt" o:gfxdata="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" strokeweight="1pt"/>
               </w:pict>
             </w:r>
@@ -125,7 +125,7 @@
                 <w:szCs w:val="30"/>
               </w:rPr>
               <w:drawing>
-                <wp:inline distT="0" distB="0" distL="0" distR="0" wp14:anchorId="3576F497" wp14:editId="2F920C0A">
+                <wp:inline distT="0" distB="0" distL="0" distR="0" wp14:anchorId="5D75738A" wp14:editId="7DDE5736">
                   <wp:extent cx="1352550" cy="1352550"/>
                   <wp:effectExtent l="0" t="0" r="0" b="0"/>
                   <wp:docPr id="8" name="Picture 8"/>
@@ -1467,6 +1467,7 @@
           <w:docPartUnique/>
         </w:docPartObj>
       </w:sdtPr>
+      <w:sdtEndPr/>
       <w:sdtContent>
         <w:p>
           <w:pPr>
@@ -11343,306 +11344,6 @@
           </w:p>
         </w:tc>
       </w:tr>
-      <w:tr>
-        <w:trPr>
-          <w:trHeight w:val="402"/>
-        </w:trPr>
-        <w:tc>
-          <w:tcPr>
-            <w:tcW w:w="1486" w:type="dxa"/>
-          </w:tcPr>
-          <w:p>
-            <w:pPr>
-              <w:pStyle w:val="TableParagraph"/>
-              <w:spacing w:before="50"/>
-              <w:ind w:left="112"/>
-              <w:jc w:val="center"/>
-              <w:rPr>
-                <w:b/>
-                <w:sz w:val="28"/>
-              </w:rPr>
-            </w:pPr>
-            <w:r>
-              <w:rPr>
-                <w:b/>
-                <w:sz w:val="28"/>
-              </w:rPr>
-              <w:t>6.1</w:t>
-            </w:r>
-          </w:p>
-        </w:tc>
-        <w:tc>
-          <w:tcPr>
-            <w:tcW w:w="7591" w:type="dxa"/>
-          </w:tcPr>
-          <w:p>
-            <w:pPr>
-              <w:pStyle w:val="TableParagraph"/>
-              <w:spacing w:before="50"/>
-              <w:ind w:left="112"/>
-              <w:rPr>
-                <w:b/>
-                <w:sz w:val="28"/>
-              </w:rPr>
-            </w:pPr>
-            <w:r>
-              <w:rPr>
-                <w:b/>
-                <w:sz w:val="28"/>
-              </w:rPr>
-              <w:t>Chọn phương thức vận chuyển</w:t>
-            </w:r>
-          </w:p>
-        </w:tc>
-      </w:tr>
-      <w:tr>
-        <w:trPr>
-          <w:trHeight w:val="400"/>
-        </w:trPr>
-        <w:tc>
-          <w:tcPr>
-            <w:tcW w:w="1486" w:type="dxa"/>
-          </w:tcPr>
-          <w:p>
-            <w:pPr>
-              <w:pStyle w:val="TableParagraph"/>
-              <w:spacing w:before="50"/>
-              <w:ind w:left="112"/>
-              <w:jc w:val="center"/>
-              <w:rPr>
-                <w:b/>
-                <w:sz w:val="28"/>
-              </w:rPr>
-            </w:pPr>
-            <w:r>
-              <w:rPr>
-                <w:b/>
-                <w:sz w:val="28"/>
-              </w:rPr>
-              <w:t>-</w:t>
-            </w:r>
-          </w:p>
-        </w:tc>
-        <w:tc>
-          <w:tcPr>
-            <w:tcW w:w="7591" w:type="dxa"/>
-          </w:tcPr>
-          <w:p>
-            <w:pPr>
-              <w:pStyle w:val="TableParagraph"/>
-              <w:spacing w:before="50"/>
-              <w:ind w:left="112"/>
-              <w:rPr>
-                <w:b/>
-                <w:sz w:val="28"/>
-              </w:rPr>
-            </w:pPr>
-            <w:r>
-              <w:rPr>
-                <w:b/>
-                <w:sz w:val="28"/>
-              </w:rPr>
-              <w:t>Chọn loại vận chuyển</w:t>
-            </w:r>
-          </w:p>
-        </w:tc>
-      </w:tr>
-      <w:tr>
-        <w:trPr>
-          <w:trHeight w:val="400"/>
-        </w:trPr>
-        <w:tc>
-          <w:tcPr>
-            <w:tcW w:w="1486" w:type="dxa"/>
-          </w:tcPr>
-          <w:p>
-            <w:pPr>
-              <w:pStyle w:val="TableParagraph"/>
-              <w:spacing w:before="50"/>
-              <w:ind w:left="112"/>
-              <w:jc w:val="center"/>
-              <w:rPr>
-                <w:b/>
-                <w:sz w:val="28"/>
-              </w:rPr>
-            </w:pPr>
-            <w:r>
-              <w:rPr>
-                <w:b/>
-                <w:sz w:val="28"/>
-              </w:rPr>
-              <w:t>6.2</w:t>
-            </w:r>
-          </w:p>
-        </w:tc>
-        <w:tc>
-          <w:tcPr>
-            <w:tcW w:w="7591" w:type="dxa"/>
-          </w:tcPr>
-          <w:p>
-            <w:pPr>
-              <w:pStyle w:val="TableParagraph"/>
-              <w:spacing w:before="50"/>
-              <w:ind w:left="112"/>
-              <w:rPr>
-                <w:b/>
-                <w:sz w:val="28"/>
-              </w:rPr>
-            </w:pPr>
-            <w:r>
-              <w:rPr>
-                <w:b/>
-                <w:sz w:val="28"/>
-              </w:rPr>
-              <w:t>Chọn phương thức thanh toán</w:t>
-            </w:r>
-          </w:p>
-        </w:tc>
-      </w:tr>
-      <w:tr>
-        <w:trPr>
-          <w:trHeight w:val="400"/>
-        </w:trPr>
-        <w:tc>
-          <w:tcPr>
-            <w:tcW w:w="1486" w:type="dxa"/>
-          </w:tcPr>
-          <w:p>
-            <w:pPr>
-              <w:pStyle w:val="TableParagraph"/>
-              <w:spacing w:before="50"/>
-              <w:ind w:left="112"/>
-              <w:jc w:val="center"/>
-              <w:rPr>
-                <w:sz w:val="28"/>
-              </w:rPr>
-            </w:pPr>
-            <w:r>
-              <w:rPr>
-                <w:sz w:val="28"/>
-              </w:rPr>
-              <w:t>-</w:t>
-            </w:r>
-          </w:p>
-        </w:tc>
-        <w:tc>
-          <w:tcPr>
-            <w:tcW w:w="7591" w:type="dxa"/>
-          </w:tcPr>
-          <w:p>
-            <w:pPr>
-              <w:pStyle w:val="TableParagraph"/>
-              <w:spacing w:before="50"/>
-              <w:ind w:left="112"/>
-              <w:rPr>
-                <w:sz w:val="28"/>
-              </w:rPr>
-            </w:pPr>
-            <w:r>
-              <w:rPr>
-                <w:sz w:val="28"/>
-              </w:rPr>
-              <w:t>Thanh toán khi nhận hàng (COD)</w:t>
-            </w:r>
-          </w:p>
-        </w:tc>
-      </w:tr>
-      <w:tr>
-        <w:trPr>
-          <w:trHeight w:val="400"/>
-        </w:trPr>
-        <w:tc>
-          <w:tcPr>
-            <w:tcW w:w="1486" w:type="dxa"/>
-          </w:tcPr>
-          <w:p>
-            <w:pPr>
-              <w:pStyle w:val="TableParagraph"/>
-              <w:spacing w:before="50"/>
-              <w:ind w:left="112"/>
-              <w:jc w:val="center"/>
-              <w:rPr>
-                <w:sz w:val="28"/>
-              </w:rPr>
-            </w:pPr>
-            <w:r>
-              <w:rPr>
-                <w:sz w:val="28"/>
-              </w:rPr>
-              <w:t>-</w:t>
-            </w:r>
-          </w:p>
-        </w:tc>
-        <w:tc>
-          <w:tcPr>
-            <w:tcW w:w="7591" w:type="dxa"/>
-          </w:tcPr>
-          <w:p>
-            <w:pPr>
-              <w:pStyle w:val="TableParagraph"/>
-              <w:spacing w:before="50"/>
-              <w:ind w:left="112"/>
-              <w:rPr>
-                <w:sz w:val="28"/>
-              </w:rPr>
-            </w:pPr>
-            <w:r>
-              <w:rPr>
-                <w:sz w:val="28"/>
-              </w:rPr>
-              <w:t>Chuyển khoản ngân hàng</w:t>
-            </w:r>
-          </w:p>
-        </w:tc>
-      </w:tr>
-      <w:tr>
-        <w:trPr>
-          <w:trHeight w:val="400"/>
-        </w:trPr>
-        <w:tc>
-          <w:tcPr>
-            <w:tcW w:w="1486" w:type="dxa"/>
-          </w:tcPr>
-          <w:p>
-            <w:pPr>
-              <w:pStyle w:val="TableParagraph"/>
-              <w:spacing w:before="50"/>
-              <w:ind w:left="112"/>
-              <w:jc w:val="center"/>
-              <w:rPr>
-                <w:sz w:val="28"/>
-              </w:rPr>
-            </w:pPr>
-            <w:r>
-              <w:rPr>
-                <w:sz w:val="28"/>
-              </w:rPr>
-              <w:t>-</w:t>
-            </w:r>
-          </w:p>
-        </w:tc>
-        <w:tc>
-          <w:tcPr>
-            <w:tcW w:w="7591" w:type="dxa"/>
-          </w:tcPr>
-          <w:p>
-            <w:pPr>
-              <w:pStyle w:val="TableParagraph"/>
-              <w:spacing w:before="50"/>
-              <w:ind w:left="112"/>
-              <w:rPr>
-                <w:sz w:val="28"/>
-              </w:rPr>
-            </w:pPr>
-            <w:r>
-              <w:rPr>
-                <w:sz w:val="28"/>
-              </w:rPr>
-              <w:t>Qua cổng thanh toán Vnpay</w:t>
-            </w:r>
-          </w:p>
-        </w:tc>
-      </w:tr>
     </w:tbl>
     <w:p>
       <w:pPr>
@@ -11909,6 +11610,8 @@
               </w:rPr>
               <w:t>Thêm mới một sản phẩm</w:t>
             </w:r>
+            <w:bookmarkStart w:id="7" w:name="_GoBack"/>
+            <w:bookmarkEnd w:id="7"/>
           </w:p>
         </w:tc>
       </w:tr>
@@ -16470,8 +16173,8 @@
           <w:szCs w:val="32"/>
         </w:rPr>
       </w:pPr>
-      <w:bookmarkStart w:id="7" w:name="_bookmark7"/>
-      <w:bookmarkEnd w:id="7"/>
+      <w:bookmarkStart w:id="8" w:name="_bookmark7"/>
+      <w:bookmarkEnd w:id="8"/>
       <w:r>
         <w:rPr>
           <w:sz w:val="32"/>
@@ -16509,8 +16212,8 @@
         <w:ind w:hanging="632"/>
         <w:jc w:val="both"/>
       </w:pPr>
-      <w:bookmarkStart w:id="8" w:name="_bookmark8"/>
-      <w:bookmarkEnd w:id="8"/>
+      <w:bookmarkStart w:id="9" w:name="_bookmark8"/>
+      <w:bookmarkEnd w:id="9"/>
       <w:r>
         <w:t>Ngôn ngữ lập trình</w:t>
       </w:r>
@@ -16613,8 +16316,8 @@
         <w:spacing w:before="120" w:after="120"/>
         <w:ind w:hanging="632"/>
       </w:pPr>
-      <w:bookmarkStart w:id="9" w:name="_bookmark9"/>
-      <w:bookmarkEnd w:id="9"/>
+      <w:bookmarkStart w:id="10" w:name="_bookmark9"/>
+      <w:bookmarkEnd w:id="10"/>
       <w:r>
         <w:t>Framework</w:t>
       </w:r>
@@ -16817,8 +16520,8 @@
         <w:ind w:hanging="632"/>
         <w:jc w:val="both"/>
       </w:pPr>
-      <w:bookmarkStart w:id="10" w:name="_bookmark10"/>
-      <w:bookmarkEnd w:id="10"/>
+      <w:bookmarkStart w:id="11" w:name="_bookmark10"/>
+      <w:bookmarkEnd w:id="11"/>
       <w:r>
         <w:t>Cơ sở dữ liệu</w:t>
       </w:r>
@@ -16851,7 +16554,7 @@
           <w:lang w:val="en-US"/>
         </w:rPr>
         <w:drawing>
-          <wp:anchor distT="0" distB="0" distL="0" distR="0" simplePos="0" relativeHeight="251655168" behindDoc="0" locked="0" layoutInCell="1" allowOverlap="1">
+          <wp:anchor distT="0" distB="0" distL="0" distR="0" simplePos="0" relativeHeight="251655168" behindDoc="0" locked="0" layoutInCell="1" allowOverlap="1" wp14:anchorId="55C4A9E7" wp14:editId="74B6E359">
             <wp:simplePos x="0" y="0"/>
             <wp:positionH relativeFrom="page">
               <wp:posOffset>1537335</wp:posOffset>
@@ -17300,8 +17003,8 @@
           <w:szCs w:val="36"/>
         </w:rPr>
       </w:pPr>
-      <w:bookmarkStart w:id="11" w:name="_bookmark11"/>
-      <w:bookmarkEnd w:id="11"/>
+      <w:bookmarkStart w:id="12" w:name="_bookmark11"/>
+      <w:bookmarkEnd w:id="12"/>
       <w:r>
         <w:rPr>
           <w:sz w:val="36"/>
@@ -17323,8 +17026,8 @@
         </w:tabs>
         <w:spacing w:before="120" w:after="120"/>
       </w:pPr>
-      <w:bookmarkStart w:id="12" w:name="_bookmark12"/>
-      <w:bookmarkEnd w:id="12"/>
+      <w:bookmarkStart w:id="13" w:name="_bookmark12"/>
+      <w:bookmarkEnd w:id="13"/>
       <w:r>
         <w:t>Xác định các tác</w:t>
       </w:r>
@@ -18734,8 +18437,8 @@
           <w:szCs w:val="32"/>
         </w:rPr>
       </w:pPr>
-      <w:bookmarkStart w:id="13" w:name="_bookmark13"/>
-      <w:bookmarkEnd w:id="13"/>
+      <w:bookmarkStart w:id="14" w:name="_bookmark13"/>
+      <w:bookmarkEnd w:id="14"/>
       <w:r>
         <w:rPr>
           <w:sz w:val="32"/>
@@ -18775,7 +18478,7 @@
           <w:lang w:val="en-US"/>
         </w:rPr>
         <w:drawing>
-          <wp:anchor distT="0" distB="0" distL="0" distR="0" simplePos="0" relativeHeight="4" behindDoc="0" locked="0" layoutInCell="1" allowOverlap="1">
+          <wp:anchor distT="0" distB="0" distL="0" distR="0" simplePos="0" relativeHeight="4" behindDoc="0" locked="0" layoutInCell="1" allowOverlap="1" wp14:anchorId="273CC4C5" wp14:editId="615581B8">
             <wp:simplePos x="0" y="0"/>
             <wp:positionH relativeFrom="page">
               <wp:posOffset>2091690</wp:posOffset>
@@ -18868,8 +18571,8 @@
           <w:szCs w:val="32"/>
         </w:rPr>
       </w:pPr>
-      <w:bookmarkStart w:id="14" w:name="_bookmark14"/>
-      <w:bookmarkEnd w:id="14"/>
+      <w:bookmarkStart w:id="15" w:name="_bookmark14"/>
+      <w:bookmarkEnd w:id="15"/>
       <w:r>
         <w:rPr>
           <w:sz w:val="32"/>
@@ -18912,7 +18615,7 @@
           <w:lang w:val="en-US"/>
         </w:rPr>
         <w:drawing>
-          <wp:anchor distT="0" distB="0" distL="0" distR="0" simplePos="0" relativeHeight="5" behindDoc="0" locked="0" layoutInCell="1" allowOverlap="1">
+          <wp:anchor distT="0" distB="0" distL="0" distR="0" simplePos="0" relativeHeight="5" behindDoc="0" locked="0" layoutInCell="1" allowOverlap="1" wp14:anchorId="285E6CFA" wp14:editId="49877355">
             <wp:simplePos x="0" y="0"/>
             <wp:positionH relativeFrom="page">
               <wp:posOffset>1089660</wp:posOffset>
@@ -18955,8 +18658,8 @@
           </wp:anchor>
         </w:drawing>
       </w:r>
-      <w:bookmarkStart w:id="15" w:name="_bookmark15"/>
-      <w:bookmarkEnd w:id="15"/>
+      <w:bookmarkStart w:id="16" w:name="_bookmark15"/>
+      <w:bookmarkEnd w:id="16"/>
       <w:r>
         <w:t>Gói khách hàng</w:t>
       </w:r>
@@ -18971,8 +18674,8 @@
           <w:sz w:val="28"/>
         </w:rPr>
       </w:pPr>
-      <w:bookmarkStart w:id="16" w:name="_bookmark16"/>
-      <w:bookmarkEnd w:id="16"/>
+      <w:bookmarkStart w:id="17" w:name="_bookmark16"/>
+      <w:bookmarkEnd w:id="17"/>
       <w:r>
         <w:rPr>
           <w:i/>
@@ -19013,7 +18716,7 @@
         </w:rPr>
         <w:lastRenderedPageBreak/>
         <w:drawing>
-          <wp:anchor distT="0" distB="0" distL="0" distR="0" simplePos="0" relativeHeight="6" behindDoc="0" locked="0" layoutInCell="1" allowOverlap="1">
+          <wp:anchor distT="0" distB="0" distL="0" distR="0" simplePos="0" relativeHeight="6" behindDoc="0" locked="0" layoutInCell="1" allowOverlap="1" wp14:anchorId="6C606CC7" wp14:editId="4A39F385">
             <wp:simplePos x="0" y="0"/>
             <wp:positionH relativeFrom="page">
               <wp:posOffset>1849120</wp:posOffset>
@@ -19056,8 +18759,8 @@
           </wp:anchor>
         </w:drawing>
       </w:r>
-      <w:bookmarkStart w:id="17" w:name="_bookmark17"/>
-      <w:bookmarkEnd w:id="17"/>
+      <w:bookmarkStart w:id="18" w:name="_bookmark17"/>
+      <w:bookmarkEnd w:id="18"/>
       <w:r>
         <w:t>Gói thành</w:t>
       </w:r>
@@ -19119,8 +18822,8 @@
         </w:tabs>
         <w:spacing w:before="120" w:after="120"/>
       </w:pPr>
-      <w:bookmarkStart w:id="18" w:name="_bookmark18"/>
-      <w:bookmarkEnd w:id="18"/>
+      <w:bookmarkStart w:id="19" w:name="_bookmark18"/>
+      <w:bookmarkEnd w:id="19"/>
       <w:r>
         <w:lastRenderedPageBreak/>
         <w:t>Gói quản trị</w:t>
@@ -19191,7 +18894,7 @@
           <w:lang w:val="en-US"/>
         </w:rPr>
         <w:drawing>
-          <wp:anchor distT="0" distB="0" distL="0" distR="0" simplePos="0" relativeHeight="7" behindDoc="0" locked="0" layoutInCell="1" allowOverlap="1">
+          <wp:anchor distT="0" distB="0" distL="0" distR="0" simplePos="0" relativeHeight="7" behindDoc="0" locked="0" layoutInCell="1" allowOverlap="1" wp14:anchorId="2C401E71" wp14:editId="32DCA8D2">
             <wp:simplePos x="0" y="0"/>
             <wp:positionH relativeFrom="page">
               <wp:posOffset>1755775</wp:posOffset>
@@ -19244,8 +18947,8 @@
           <w:sz w:val="28"/>
         </w:rPr>
       </w:pPr>
-      <w:bookmarkStart w:id="19" w:name="_bookmark19"/>
-      <w:bookmarkEnd w:id="19"/>
+      <w:bookmarkStart w:id="20" w:name="_bookmark19"/>
+      <w:bookmarkEnd w:id="20"/>
       <w:r>
         <w:rPr>
           <w:i/>
@@ -19296,7 +18999,7 @@
           <w:lang w:val="en-US"/>
         </w:rPr>
         <w:drawing>
-          <wp:anchor distT="0" distB="0" distL="0" distR="0" simplePos="0" relativeHeight="8" behindDoc="0" locked="0" layoutInCell="1" allowOverlap="1">
+          <wp:anchor distT="0" distB="0" distL="0" distR="0" simplePos="0" relativeHeight="8" behindDoc="0" locked="0" layoutInCell="1" allowOverlap="1" wp14:anchorId="56455CF9" wp14:editId="3E0CB0BF">
             <wp:simplePos x="0" y="0"/>
             <wp:positionH relativeFrom="page">
               <wp:posOffset>1841500</wp:posOffset>
@@ -19349,8 +19052,8 @@
           <w:sz w:val="28"/>
         </w:rPr>
       </w:pPr>
-      <w:bookmarkStart w:id="20" w:name="_bookmark20"/>
-      <w:bookmarkEnd w:id="20"/>
+      <w:bookmarkStart w:id="21" w:name="_bookmark20"/>
+      <w:bookmarkEnd w:id="21"/>
       <w:r>
         <w:rPr>
           <w:i/>
@@ -19422,7 +19125,7 @@
           <w:lang w:val="en-US"/>
         </w:rPr>
         <w:drawing>
-          <wp:anchor distT="0" distB="0" distL="0" distR="0" simplePos="0" relativeHeight="9" behindDoc="0" locked="0" layoutInCell="1" allowOverlap="1">
+          <wp:anchor distT="0" distB="0" distL="0" distR="0" simplePos="0" relativeHeight="9" behindDoc="0" locked="0" layoutInCell="1" allowOverlap="1" wp14:anchorId="07E565A2" wp14:editId="0678ADF4">
             <wp:simplePos x="0" y="0"/>
             <wp:positionH relativeFrom="page">
               <wp:posOffset>1955800</wp:posOffset>
@@ -19475,8 +19178,8 @@
           <w:sz w:val="28"/>
         </w:rPr>
       </w:pPr>
-      <w:bookmarkStart w:id="21" w:name="_bookmark21"/>
-      <w:bookmarkEnd w:id="21"/>
+      <w:bookmarkStart w:id="22" w:name="_bookmark21"/>
+      <w:bookmarkEnd w:id="22"/>
       <w:r>
         <w:rPr>
           <w:i/>
@@ -19527,7 +19230,7 @@
           <w:lang w:val="en-US"/>
         </w:rPr>
         <w:drawing>
-          <wp:anchor distT="0" distB="0" distL="0" distR="0" simplePos="0" relativeHeight="10" behindDoc="0" locked="0" layoutInCell="1" allowOverlap="1">
+          <wp:anchor distT="0" distB="0" distL="0" distR="0" simplePos="0" relativeHeight="10" behindDoc="0" locked="0" layoutInCell="1" allowOverlap="1" wp14:anchorId="5EB622A9" wp14:editId="0C5C9001">
             <wp:simplePos x="0" y="0"/>
             <wp:positionH relativeFrom="page">
               <wp:posOffset>1841500</wp:posOffset>
@@ -19581,8 +19284,8 @@
           <w:sz w:val="28"/>
         </w:rPr>
       </w:pPr>
-      <w:bookmarkStart w:id="22" w:name="_bookmark22"/>
-      <w:bookmarkEnd w:id="22"/>
+      <w:bookmarkStart w:id="23" w:name="_bookmark22"/>
+      <w:bookmarkEnd w:id="23"/>
       <w:r>
         <w:rPr>
           <w:i/>
@@ -19647,7 +19350,7 @@
           <w:lang w:val="en-US"/>
         </w:rPr>
         <w:drawing>
-          <wp:anchor distT="0" distB="0" distL="0" distR="0" simplePos="0" relativeHeight="11" behindDoc="0" locked="0" layoutInCell="1" allowOverlap="1">
+          <wp:anchor distT="0" distB="0" distL="0" distR="0" simplePos="0" relativeHeight="11" behindDoc="0" locked="0" layoutInCell="1" allowOverlap="1" wp14:anchorId="560D2B56" wp14:editId="52446C31">
             <wp:simplePos x="0" y="0"/>
             <wp:positionH relativeFrom="page">
               <wp:posOffset>1651000</wp:posOffset>
@@ -19700,8 +19403,8 @@
           <w:sz w:val="28"/>
         </w:rPr>
       </w:pPr>
-      <w:bookmarkStart w:id="23" w:name="_bookmark23"/>
-      <w:bookmarkEnd w:id="23"/>
+      <w:bookmarkStart w:id="24" w:name="_bookmark23"/>
+      <w:bookmarkEnd w:id="24"/>
       <w:r>
         <w:rPr>
           <w:i/>
@@ -19752,7 +19455,7 @@
           <w:lang w:val="en-US"/>
         </w:rPr>
         <w:drawing>
-          <wp:anchor distT="0" distB="0" distL="0" distR="0" simplePos="0" relativeHeight="12" behindDoc="0" locked="0" layoutInCell="1" allowOverlap="1">
+          <wp:anchor distT="0" distB="0" distL="0" distR="0" simplePos="0" relativeHeight="12" behindDoc="0" locked="0" layoutInCell="1" allowOverlap="1" wp14:anchorId="25F7677F" wp14:editId="1F4A48DB">
             <wp:simplePos x="0" y="0"/>
             <wp:positionH relativeFrom="page">
               <wp:posOffset>1651000</wp:posOffset>
@@ -19806,8 +19509,8 @@
           <w:sz w:val="28"/>
         </w:rPr>
       </w:pPr>
-      <w:bookmarkStart w:id="24" w:name="_bookmark24"/>
-      <w:bookmarkEnd w:id="24"/>
+      <w:bookmarkStart w:id="25" w:name="_bookmark24"/>
+      <w:bookmarkEnd w:id="25"/>
       <w:r>
         <w:rPr>
           <w:sz w:val="24"/>
@@ -19884,7 +19587,7 @@
         </w:rPr>
         <w:lastRenderedPageBreak/>
         <w:drawing>
-          <wp:inline distT="0" distB="0" distL="0" distR="0">
+          <wp:inline distT="0" distB="0" distL="0" distR="0" wp14:anchorId="7FD9CB9A" wp14:editId="6164CF2D">
             <wp:extent cx="5000625" cy="3543300"/>
             <wp:effectExtent l="0" t="0" r="0" b="0"/>
             <wp:docPr id="25" name="image13.jpeg"/>
@@ -19939,8 +19642,8 @@
           <w:sz w:val="28"/>
         </w:rPr>
       </w:pPr>
-      <w:bookmarkStart w:id="25" w:name="_bookmark25"/>
-      <w:bookmarkEnd w:id="25"/>
+      <w:bookmarkStart w:id="26" w:name="_bookmark25"/>
+      <w:bookmarkEnd w:id="26"/>
       <w:r>
         <w:rPr>
           <w:i/>
@@ -19991,7 +19694,7 @@
           <w:lang w:val="en-US"/>
         </w:rPr>
         <w:drawing>
-          <wp:anchor distT="0" distB="0" distL="0" distR="0" simplePos="0" relativeHeight="13" behindDoc="0" locked="0" layoutInCell="1" allowOverlap="1">
+          <wp:anchor distT="0" distB="0" distL="0" distR="0" simplePos="0" relativeHeight="13" behindDoc="0" locked="0" layoutInCell="1" allowOverlap="1" wp14:anchorId="736CD17A" wp14:editId="30AD373F">
             <wp:simplePos x="0" y="0"/>
             <wp:positionH relativeFrom="page">
               <wp:posOffset>1651000</wp:posOffset>
@@ -20045,8 +19748,8 @@
           <w:sz w:val="28"/>
         </w:rPr>
       </w:pPr>
-      <w:bookmarkStart w:id="26" w:name="_bookmark26"/>
-      <w:bookmarkEnd w:id="26"/>
+      <w:bookmarkStart w:id="27" w:name="_bookmark26"/>
+      <w:bookmarkEnd w:id="27"/>
       <w:r>
         <w:rPr>
           <w:sz w:val="24"/>
@@ -20123,7 +19826,7 @@
         </w:rPr>
         <w:lastRenderedPageBreak/>
         <w:drawing>
-          <wp:inline distT="0" distB="0" distL="0" distR="0">
+          <wp:inline distT="0" distB="0" distL="0" distR="0" wp14:anchorId="002D4488" wp14:editId="63AAC44F">
             <wp:extent cx="5000625" cy="1885950"/>
             <wp:effectExtent l="0" t="0" r="0" b="0"/>
             <wp:docPr id="29" name="image15.jpeg"/>
@@ -20178,8 +19881,8 @@
           <w:sz w:val="28"/>
         </w:rPr>
       </w:pPr>
-      <w:bookmarkStart w:id="27" w:name="_bookmark27"/>
-      <w:bookmarkEnd w:id="27"/>
+      <w:bookmarkStart w:id="28" w:name="_bookmark27"/>
+      <w:bookmarkEnd w:id="28"/>
       <w:r>
         <w:rPr>
           <w:i/>
@@ -20230,7 +19933,7 @@
           <w:lang w:val="en-US"/>
         </w:rPr>
         <w:drawing>
-          <wp:anchor distT="0" distB="0" distL="0" distR="0" simplePos="0" relativeHeight="14" behindDoc="0" locked="0" layoutInCell="1" allowOverlap="1">
+          <wp:anchor distT="0" distB="0" distL="0" distR="0" simplePos="0" relativeHeight="14" behindDoc="0" locked="0" layoutInCell="1" allowOverlap="1" wp14:anchorId="2939FFAA" wp14:editId="3111F360">
             <wp:simplePos x="0" y="0"/>
             <wp:positionH relativeFrom="page">
               <wp:posOffset>1603375</wp:posOffset>
@@ -20283,8 +19986,8 @@
           <w:sz w:val="28"/>
         </w:rPr>
       </w:pPr>
-      <w:bookmarkStart w:id="28" w:name="_bookmark28"/>
-      <w:bookmarkEnd w:id="28"/>
+      <w:bookmarkStart w:id="29" w:name="_bookmark28"/>
+      <w:bookmarkEnd w:id="29"/>
       <w:r>
         <w:rPr>
           <w:i/>
@@ -20368,7 +20071,7 @@
         </w:rPr>
         <w:lastRenderedPageBreak/>
         <w:drawing>
-          <wp:inline distT="0" distB="0" distL="0" distR="0">
+          <wp:inline distT="0" distB="0" distL="0" distR="0" wp14:anchorId="18B282D1" wp14:editId="135156B5">
             <wp:extent cx="5313618" cy="4131087"/>
             <wp:effectExtent l="0" t="0" r="0" b="0"/>
             <wp:docPr id="33" name="image17.jpeg"/>
@@ -20423,8 +20126,8 @@
           <w:sz w:val="28"/>
         </w:rPr>
       </w:pPr>
-      <w:bookmarkStart w:id="29" w:name="_bookmark29"/>
-      <w:bookmarkEnd w:id="29"/>
+      <w:bookmarkStart w:id="30" w:name="_bookmark29"/>
+      <w:bookmarkEnd w:id="30"/>
       <w:r>
         <w:rPr>
           <w:i/>
@@ -20475,7 +20178,7 @@
           <w:lang w:val="en-US"/>
         </w:rPr>
         <w:drawing>
-          <wp:anchor distT="0" distB="0" distL="0" distR="0" simplePos="0" relativeHeight="15" behindDoc="0" locked="0" layoutInCell="1" allowOverlap="1">
+          <wp:anchor distT="0" distB="0" distL="0" distR="0" simplePos="0" relativeHeight="15" behindDoc="0" locked="0" layoutInCell="1" allowOverlap="1" wp14:anchorId="32781BDF" wp14:editId="44D203BE">
             <wp:simplePos x="0" y="0"/>
             <wp:positionH relativeFrom="page">
               <wp:posOffset>2011045</wp:posOffset>
@@ -20528,8 +20231,8 @@
           <w:sz w:val="28"/>
         </w:rPr>
       </w:pPr>
-      <w:bookmarkStart w:id="30" w:name="_bookmark30"/>
-      <w:bookmarkEnd w:id="30"/>
+      <w:bookmarkStart w:id="31" w:name="_bookmark30"/>
+      <w:bookmarkEnd w:id="31"/>
       <w:r>
         <w:rPr>
           <w:i/>
@@ -20566,8 +20269,8 @@
           <w:szCs w:val="32"/>
         </w:rPr>
       </w:pPr>
-      <w:bookmarkStart w:id="31" w:name="_bookmark31"/>
-      <w:bookmarkEnd w:id="31"/>
+      <w:bookmarkStart w:id="32" w:name="_bookmark31"/>
+      <w:bookmarkEnd w:id="32"/>
       <w:r>
         <w:rPr>
           <w:sz w:val="32"/>
@@ -20604,8 +20307,8 @@
         </w:tabs>
         <w:spacing w:before="120" w:after="120"/>
       </w:pPr>
-      <w:bookmarkStart w:id="32" w:name="_bookmark32"/>
-      <w:bookmarkEnd w:id="32"/>
+      <w:bookmarkStart w:id="33" w:name="_bookmark32"/>
+      <w:bookmarkEnd w:id="33"/>
       <w:r>
         <w:t>Đăng nhập website</w:t>
       </w:r>
@@ -21662,8 +21365,8 @@
         </w:tabs>
         <w:spacing w:before="120" w:after="120"/>
       </w:pPr>
-      <w:bookmarkStart w:id="33" w:name="_bookmark33"/>
-      <w:bookmarkEnd w:id="33"/>
+      <w:bookmarkStart w:id="34" w:name="_bookmark33"/>
+      <w:bookmarkEnd w:id="34"/>
       <w:r>
         <w:t>Đăng xuất website</w:t>
       </w:r>
@@ -21978,8 +21681,8 @@
         </w:tabs>
         <w:spacing w:before="119" w:after="120"/>
       </w:pPr>
-      <w:bookmarkStart w:id="34" w:name="_bookmark34"/>
-      <w:bookmarkEnd w:id="34"/>
+      <w:bookmarkStart w:id="35" w:name="_bookmark34"/>
+      <w:bookmarkEnd w:id="35"/>
       <w:r>
         <w:t>Đăng ký</w:t>
       </w:r>
@@ -22321,8 +22024,8 @@
         </w:tabs>
         <w:spacing w:before="120" w:after="120"/>
       </w:pPr>
-      <w:bookmarkStart w:id="35" w:name="_bookmark35"/>
-      <w:bookmarkEnd w:id="35"/>
+      <w:bookmarkStart w:id="36" w:name="_bookmark35"/>
+      <w:bookmarkEnd w:id="36"/>
       <w:r>
         <w:t>Tìm kiếm sản</w:t>
       </w:r>
@@ -22883,8 +22586,8 @@
         <w:spacing w:before="120" w:after="120"/>
         <w:jc w:val="both"/>
       </w:pPr>
-      <w:bookmarkStart w:id="36" w:name="_bookmark36"/>
-      <w:bookmarkEnd w:id="36"/>
+      <w:bookmarkStart w:id="37" w:name="_bookmark36"/>
+      <w:bookmarkEnd w:id="37"/>
       <w:r>
         <w:t>Xem chi tiết sản</w:t>
       </w:r>
@@ -23602,8 +23305,8 @@
         <w:spacing w:before="120" w:after="120"/>
         <w:jc w:val="both"/>
       </w:pPr>
-      <w:bookmarkStart w:id="37" w:name="_bookmark37"/>
-      <w:bookmarkEnd w:id="37"/>
+      <w:bookmarkStart w:id="38" w:name="_bookmark37"/>
+      <w:bookmarkEnd w:id="38"/>
       <w:r>
         <w:t>Giỏ</w:t>
       </w:r>
@@ -24315,8 +24018,8 @@
         </w:tabs>
         <w:spacing w:before="120" w:after="120"/>
       </w:pPr>
-      <w:bookmarkStart w:id="38" w:name="_bookmark38"/>
-      <w:bookmarkEnd w:id="38"/>
+      <w:bookmarkStart w:id="39" w:name="_bookmark38"/>
+      <w:bookmarkEnd w:id="39"/>
       <w:r>
         <w:t>Đánh giá sản</w:t>
       </w:r>
@@ -24954,8 +24657,8 @@
         </w:tabs>
         <w:spacing w:before="187"/>
       </w:pPr>
-      <w:bookmarkStart w:id="39" w:name="_bookmark39"/>
-      <w:bookmarkEnd w:id="39"/>
+      <w:bookmarkStart w:id="40" w:name="_bookmark39"/>
+      <w:bookmarkEnd w:id="40"/>
       <w:r>
         <w:t>Bình luận sản</w:t>
       </w:r>
@@ -25343,8 +25046,8 @@
         <w:spacing w:before="120" w:after="120"/>
         <w:ind w:right="6277"/>
       </w:pPr>
-      <w:bookmarkStart w:id="40" w:name="_bookmark40"/>
-      <w:bookmarkEnd w:id="40"/>
+      <w:bookmarkStart w:id="41" w:name="_bookmark40"/>
+      <w:bookmarkEnd w:id="41"/>
       <w:r>
         <w:t>Quản lý tài khoản cá</w:t>
       </w:r>
@@ -26039,8 +25742,8 @@
         <w:spacing w:before="120" w:after="120"/>
         <w:ind w:left="1614" w:hanging="773"/>
       </w:pPr>
-      <w:bookmarkStart w:id="41" w:name="_bookmark41"/>
-      <w:bookmarkEnd w:id="41"/>
+      <w:bookmarkStart w:id="42" w:name="_bookmark41"/>
+      <w:bookmarkEnd w:id="42"/>
       <w:r>
         <w:t>Quản lý thuộc</w:t>
       </w:r>
@@ -26494,8 +26197,8 @@
         <w:spacing w:before="120" w:after="120"/>
         <w:ind w:left="1614" w:hanging="773"/>
       </w:pPr>
-      <w:bookmarkStart w:id="42" w:name="_bookmark42"/>
-      <w:bookmarkEnd w:id="42"/>
+      <w:bookmarkStart w:id="43" w:name="_bookmark42"/>
+      <w:bookmarkEnd w:id="43"/>
       <w:r>
         <w:t>Quản lý danh</w:t>
       </w:r>
@@ -26965,8 +26668,8 @@
         <w:spacing w:before="120" w:after="120"/>
         <w:ind w:left="1614" w:hanging="773"/>
       </w:pPr>
-      <w:bookmarkStart w:id="43" w:name="_bookmark43"/>
-      <w:bookmarkEnd w:id="43"/>
+      <w:bookmarkStart w:id="44" w:name="_bookmark43"/>
+      <w:bookmarkEnd w:id="44"/>
       <w:r>
         <w:t>Quản lý sản</w:t>
       </w:r>
@@ -27443,8 +27146,8 @@
         <w:spacing w:before="120" w:after="120"/>
         <w:ind w:left="1614" w:hanging="773"/>
       </w:pPr>
-      <w:bookmarkStart w:id="44" w:name="_bookmark44"/>
-      <w:bookmarkEnd w:id="44"/>
+      <w:bookmarkStart w:id="45" w:name="_bookmark44"/>
+      <w:bookmarkEnd w:id="45"/>
       <w:r>
         <w:t>Quản lý Xóa đánh giá sản</w:t>
       </w:r>
@@ -27858,8 +27561,8 @@
         <w:spacing w:before="120" w:after="120"/>
         <w:ind w:left="1614" w:hanging="773"/>
       </w:pPr>
-      <w:bookmarkStart w:id="45" w:name="_bookmark45"/>
-      <w:bookmarkEnd w:id="45"/>
+      <w:bookmarkStart w:id="46" w:name="_bookmark45"/>
+      <w:bookmarkEnd w:id="46"/>
       <w:r>
         <w:t>Quản lý xóa bình</w:t>
       </w:r>
@@ -28288,8 +27991,8 @@
         <w:spacing w:before="120" w:after="120"/>
         <w:ind w:left="1614" w:hanging="773"/>
       </w:pPr>
-      <w:bookmarkStart w:id="46" w:name="_bookmark46"/>
-      <w:bookmarkEnd w:id="46"/>
+      <w:bookmarkStart w:id="47" w:name="_bookmark46"/>
+      <w:bookmarkEnd w:id="47"/>
       <w:r>
         <w:t>Quản lý</w:t>
       </w:r>
@@ -28983,8 +28686,8 @@
         <w:spacing w:before="120" w:after="120"/>
         <w:ind w:left="1614" w:hanging="773"/>
       </w:pPr>
-      <w:bookmarkStart w:id="47" w:name="_bookmark47"/>
-      <w:bookmarkEnd w:id="47"/>
+      <w:bookmarkStart w:id="48" w:name="_bookmark47"/>
+      <w:bookmarkEnd w:id="48"/>
       <w:r>
         <w:t>Quản lý bài</w:t>
       </w:r>
@@ -29678,8 +29381,8 @@
         <w:spacing w:before="120" w:after="120"/>
         <w:ind w:left="1614" w:hanging="773"/>
       </w:pPr>
-      <w:bookmarkStart w:id="48" w:name="_bookmark48"/>
-      <w:bookmarkEnd w:id="48"/>
+      <w:bookmarkStart w:id="49" w:name="_bookmark48"/>
+      <w:bookmarkEnd w:id="49"/>
       <w:r>
         <w:t>Quản lý đơn đặt</w:t>
       </w:r>
@@ -30117,8 +29820,8 @@
         <w:spacing w:before="73"/>
         <w:ind w:left="1614" w:hanging="773"/>
       </w:pPr>
-      <w:bookmarkStart w:id="49" w:name="_bookmark49"/>
-      <w:bookmarkEnd w:id="49"/>
+      <w:bookmarkStart w:id="50" w:name="_bookmark49"/>
+      <w:bookmarkEnd w:id="50"/>
       <w:r>
         <w:t>Quản lý tài khoản</w:t>
       </w:r>
@@ -30584,8 +30287,8 @@
         <w:spacing w:before="120" w:after="120"/>
         <w:ind w:left="1614" w:hanging="773"/>
       </w:pPr>
-      <w:bookmarkStart w:id="50" w:name="_bookmark50"/>
-      <w:bookmarkEnd w:id="50"/>
+      <w:bookmarkStart w:id="51" w:name="_bookmark50"/>
+      <w:bookmarkEnd w:id="51"/>
       <w:r>
         <w:t>Quản lý khách</w:t>
       </w:r>
@@ -31192,8 +30895,8 @@
         <w:spacing w:before="120" w:after="120"/>
         <w:ind w:left="1614" w:hanging="773"/>
       </w:pPr>
-      <w:bookmarkStart w:id="51" w:name="_bookmark51"/>
-      <w:bookmarkEnd w:id="51"/>
+      <w:bookmarkStart w:id="52" w:name="_bookmark51"/>
+      <w:bookmarkEnd w:id="52"/>
       <w:r>
         <w:t>Quản lý nhà cung</w:t>
       </w:r>
@@ -31885,8 +31588,8 @@
         <w:spacing w:before="120" w:after="120"/>
         <w:ind w:left="1614" w:hanging="773"/>
       </w:pPr>
-      <w:bookmarkStart w:id="52" w:name="_bookmark52"/>
-      <w:bookmarkEnd w:id="52"/>
+      <w:bookmarkStart w:id="53" w:name="_bookmark52"/>
+      <w:bookmarkEnd w:id="53"/>
       <w:r>
         <w:t>Quản lý</w:t>
       </w:r>
@@ -32339,8 +32042,8 @@
         <w:spacing w:before="120" w:after="120"/>
         <w:ind w:left="1614" w:hanging="773"/>
       </w:pPr>
-      <w:bookmarkStart w:id="53" w:name="_bookmark53"/>
-      <w:bookmarkEnd w:id="53"/>
+      <w:bookmarkStart w:id="54" w:name="_bookmark53"/>
+      <w:bookmarkEnd w:id="54"/>
       <w:r>
         <w:t>Quản lý sự</w:t>
       </w:r>
@@ -32766,8 +32469,8 @@
         <w:spacing w:before="120" w:after="120"/>
         <w:ind w:left="1614" w:hanging="773"/>
       </w:pPr>
-      <w:bookmarkStart w:id="54" w:name="_bookmark54"/>
-      <w:bookmarkEnd w:id="54"/>
+      <w:bookmarkStart w:id="55" w:name="_bookmark54"/>
+      <w:bookmarkEnd w:id="55"/>
       <w:r>
         <w:t>Quản lý chính</w:t>
       </w:r>
@@ -33218,8 +32921,8 @@
         <w:spacing w:before="120" w:after="120"/>
         <w:ind w:left="1614" w:hanging="773"/>
       </w:pPr>
-      <w:bookmarkStart w:id="55" w:name="_bookmark55"/>
-      <w:bookmarkEnd w:id="55"/>
+      <w:bookmarkStart w:id="56" w:name="_bookmark55"/>
+      <w:bookmarkEnd w:id="56"/>
       <w:r>
         <w:t>Quản lý thống</w:t>
       </w:r>
@@ -33646,8 +33349,8 @@
         <w:spacing w:before="120" w:after="120"/>
         <w:ind w:left="1264" w:hanging="423"/>
       </w:pPr>
-      <w:bookmarkStart w:id="56" w:name="_bookmark56"/>
-      <w:bookmarkEnd w:id="56"/>
+      <w:bookmarkStart w:id="57" w:name="_bookmark56"/>
+      <w:bookmarkEnd w:id="57"/>
       <w:r>
         <w:t>Biểu đồ hoạt động (Active</w:t>
       </w:r>
@@ -33678,7 +33381,7 @@
         </w:rPr>
       </w:pPr>
       <w:r>
-        <w:pict>
+        <w:pict w14:anchorId="47E65FAC">
           <v:group id="_x0000_s1224" style="position:absolute;left:0;text-align:left;margin-left:84.55pt;margin-top:26.55pt;width:423pt;height:413.6pt;z-index:-15719936;mso-wrap-distance-left:0;mso-wrap-distance-right:0;mso-position-horizontal-relative:page" coordorigin="1701,556" coordsize="8460,8272">
             <v:shapetype id="_x0000_t75" coordsize="21600,21600" o:spt="75" o:preferrelative="t" path="m@4@5l@4@11@9@11@9@5xe" filled="f" stroked="f">
               <v:stroke joinstyle="miter"/>
@@ -33809,8 +33512,8 @@
           <w:sz w:val="28"/>
         </w:rPr>
       </w:pPr>
-      <w:bookmarkStart w:id="57" w:name="_bookmark57"/>
-      <w:bookmarkEnd w:id="57"/>
+      <w:bookmarkStart w:id="58" w:name="_bookmark57"/>
+      <w:bookmarkEnd w:id="58"/>
       <w:r>
         <w:rPr>
           <w:i/>
@@ -33847,7 +33550,7 @@
       </w:pPr>
       <w:r>
         <w:lastRenderedPageBreak/>
-        <w:pict>
+        <w:pict w14:anchorId="6BF1268B">
           <v:group id="_x0000_s1221" style="position:absolute;left:0;text-align:left;margin-left:169.4pt;margin-top:26.25pt;width:315.75pt;height:213.85pt;z-index:-15718912;mso-wrap-distance-left:0;mso-wrap-distance-right:0;mso-position-horizontal-relative:page" coordorigin="3388,492" coordsize="6315,4310">
             <v:shape id="_x0000_s1223" type="#_x0000_t75" style="position:absolute;left:3387;top:492;width:6315;height:4310">
               <v:imagedata r:id="rId33" o:title=""/>
@@ -33992,7 +33695,7 @@
         <w:spacing w:before="120" w:after="120"/>
       </w:pPr>
       <w:r>
-        <w:pict>
+        <w:pict w14:anchorId="1D609344">
           <v:group id="_x0000_s1218" style="position:absolute;left:0;text-align:left;margin-left:124.7pt;margin-top:34.45pt;width:409.4pt;height:344.5pt;z-index:-15717888;mso-wrap-distance-left:0;mso-wrap-distance-right:0;mso-position-horizontal-relative:page" coordorigin="2450,493" coordsize="8188,8364">
             <v:shape id="_x0000_s1220" type="#_x0000_t75" style="position:absolute;left:2450;top:492;width:8188;height:8364">
               <v:imagedata r:id="rId34" o:title=""/>
@@ -34088,8 +33791,8 @@
           <w:sz w:val="28"/>
         </w:rPr>
       </w:pPr>
-      <w:bookmarkStart w:id="58" w:name="_bookmark58"/>
-      <w:bookmarkEnd w:id="58"/>
+      <w:bookmarkStart w:id="59" w:name="_bookmark58"/>
+      <w:bookmarkEnd w:id="59"/>
       <w:r>
         <w:rPr>
           <w:i/>
@@ -34123,7 +33826,7 @@
       </w:pPr>
       <w:r>
         <w:lastRenderedPageBreak/>
-        <w:pict>
+        <w:pict w14:anchorId="1CFE596B">
           <v:group id="_x0000_s1215" style="position:absolute;left:0;text-align:left;margin-left:142.7pt;margin-top:24.6pt;width:369.15pt;height:334.25pt;z-index:-15716864;mso-wrap-distance-left:0;mso-wrap-distance-right:0;mso-position-horizontal-relative:page" coordorigin="2854,492" coordsize="7383,6685">
             <v:shape id="_x0000_s1217" type="#_x0000_t75" style="position:absolute;left:2853;top:492;width:7383;height:6685">
               <v:imagedata r:id="rId35" o:title=""/>
@@ -34246,8 +33949,8 @@
           <w:sz w:val="28"/>
         </w:rPr>
       </w:pPr>
-      <w:bookmarkStart w:id="59" w:name="_bookmark59"/>
-      <w:bookmarkEnd w:id="59"/>
+      <w:bookmarkStart w:id="60" w:name="_bookmark59"/>
+      <w:bookmarkEnd w:id="60"/>
       <w:r>
         <w:rPr>
           <w:i/>
@@ -34281,7 +33984,7 @@
       </w:pPr>
       <w:r>
         <w:lastRenderedPageBreak/>
-        <w:pict>
+        <w:pict w14:anchorId="64B91CCF">
           <v:group id="_x0000_s1211" style="position:absolute;left:0;text-align:left;margin-left:151.5pt;margin-top:24.6pt;width:351.5pt;height:293.8pt;z-index:-15715328;mso-wrap-distance-left:0;mso-wrap-distance-right:0;mso-position-horizontal-relative:page" coordorigin="3030,492" coordsize="7030,5876">
             <v:shape id="_x0000_s1214" type="#_x0000_t75" style="position:absolute;left:3030;top:492;width:7030;height:5876">
               <v:imagedata r:id="rId36" o:title=""/>
@@ -34355,8 +34058,8 @@
           <w:sz w:val="28"/>
         </w:rPr>
       </w:pPr>
-      <w:bookmarkStart w:id="60" w:name="_bookmark60"/>
-      <w:bookmarkEnd w:id="60"/>
+      <w:bookmarkStart w:id="61" w:name="_bookmark60"/>
+      <w:bookmarkEnd w:id="61"/>
       <w:r>
         <w:rPr>
           <w:i/>
@@ -34378,7 +34081,7 @@
         <w:spacing w:before="202"/>
       </w:pPr>
       <w:r>
-        <w:pict>
+        <w:pict w14:anchorId="2C932138">
           <v:group id="_x0000_s1207" style="position:absolute;left:0;text-align:left;margin-left:165.65pt;margin-top:30.95pt;width:323.25pt;height:246.8pt;z-index:-15713792;mso-wrap-distance-left:0;mso-wrap-distance-right:0;mso-position-horizontal-relative:page" coordorigin="3313,619" coordsize="6465,4936">
             <v:shape id="_x0000_s1210" type="#_x0000_t75" style="position:absolute;left:3312;top:618;width:6465;height:4936">
               <v:imagedata r:id="rId37" o:title=""/>
@@ -34452,8 +34155,8 @@
           <w:sz w:val="28"/>
         </w:rPr>
       </w:pPr>
-      <w:bookmarkStart w:id="61" w:name="_bookmark61"/>
-      <w:bookmarkEnd w:id="61"/>
+      <w:bookmarkStart w:id="62" w:name="_bookmark61"/>
+      <w:bookmarkEnd w:id="62"/>
       <w:r>
         <w:rPr>
           <w:i/>
@@ -34488,7 +34191,7 @@
       </w:pPr>
       <w:r>
         <w:lastRenderedPageBreak/>
-        <w:pict>
+        <w:pict w14:anchorId="236E2A07">
           <v:group id="_x0000_s1204" style="position:absolute;left:0;text-align:left;margin-left:126.25pt;margin-top:24.6pt;width:401.3pt;height:575.95pt;z-index:-15712768;mso-wrap-distance-left:0;mso-wrap-distance-right:0;mso-position-horizontal-relative:page" coordorigin="2525,492" coordsize="8026,11519">
             <v:shape id="_x0000_s1206" type="#_x0000_t75" style="position:absolute;left:2525;top:492;width:8026;height:11519">
               <v:imagedata r:id="rId38" o:title=""/>
@@ -34606,8 +34309,8 @@
           <w:sz w:val="28"/>
         </w:rPr>
       </w:pPr>
-      <w:bookmarkStart w:id="62" w:name="_bookmark62"/>
-      <w:bookmarkEnd w:id="62"/>
+      <w:bookmarkStart w:id="63" w:name="_bookmark62"/>
+      <w:bookmarkEnd w:id="63"/>
       <w:r>
         <w:rPr>
           <w:i/>
@@ -34641,7 +34344,7 @@
       </w:pPr>
       <w:r>
         <w:lastRenderedPageBreak/>
-        <w:pict>
+        <w:pict w14:anchorId="544F095C">
           <v:group id="_x0000_s1201" style="position:absolute;left:0;text-align:left;margin-left:130.4pt;margin-top:24.6pt;width:393.8pt;height:578.8pt;z-index:-15711744;mso-wrap-distance-left:0;mso-wrap-distance-right:0;mso-position-horizontal-relative:page" coordorigin="2608,492" coordsize="7876,11576">
             <v:shape id="_x0000_s1203" type="#_x0000_t75" style="position:absolute;left:2608;top:492;width:7874;height:11576">
               <v:imagedata r:id="rId39" o:title=""/>
@@ -34746,8 +34449,8 @@
           <w:sz w:val="28"/>
         </w:rPr>
       </w:pPr>
-      <w:bookmarkStart w:id="63" w:name="_bookmark63"/>
-      <w:bookmarkEnd w:id="63"/>
+      <w:bookmarkStart w:id="64" w:name="_bookmark63"/>
+      <w:bookmarkEnd w:id="64"/>
       <w:r>
         <w:rPr>
           <w:i/>
@@ -34781,7 +34484,7 @@
       </w:pPr>
       <w:r>
         <w:lastRenderedPageBreak/>
-        <w:pict>
+        <w:pict w14:anchorId="7726FED0">
           <v:group id="_x0000_s1198" style="position:absolute;left:0;text-align:left;margin-left:137.4pt;margin-top:24.6pt;width:379.75pt;height:322.7pt;z-index:-15710720;mso-wrap-distance-left:0;mso-wrap-distance-right:0;mso-position-horizontal-relative:page" coordorigin="2748,492" coordsize="7595,6454">
             <v:shape id="_x0000_s1200" type="#_x0000_t75" style="position:absolute;left:2747;top:492;width:7595;height:6454">
               <v:imagedata r:id="rId40" o:title=""/>
@@ -34890,8 +34593,8 @@
           <w:sz w:val="28"/>
         </w:rPr>
       </w:pPr>
-      <w:bookmarkStart w:id="64" w:name="_bookmark64"/>
-      <w:bookmarkEnd w:id="64"/>
+      <w:bookmarkStart w:id="65" w:name="_bookmark64"/>
+      <w:bookmarkEnd w:id="65"/>
       <w:r>
         <w:rPr>
           <w:i/>
@@ -34926,7 +34629,7 @@
       </w:pPr>
       <w:r>
         <w:lastRenderedPageBreak/>
-        <w:pict>
+        <w:pict w14:anchorId="2E0A5D16">
           <v:group id="_x0000_s1195" style="position:absolute;left:0;text-align:left;margin-left:130pt;margin-top:24.6pt;width:394.55pt;height:568.9pt;z-index:-15709696;mso-wrap-distance-left:0;mso-wrap-distance-right:0;mso-position-horizontal-relative:page" coordorigin="2600,492" coordsize="7891,11378">
             <v:shape id="_x0000_s1197" type="#_x0000_t75" style="position:absolute;left:2599;top:492;width:7891;height:11378">
               <v:imagedata r:id="rId41" o:title=""/>
@@ -35040,8 +34743,8 @@
           <w:sz w:val="28"/>
         </w:rPr>
       </w:pPr>
-      <w:bookmarkStart w:id="65" w:name="_bookmark65"/>
-      <w:bookmarkEnd w:id="65"/>
+      <w:bookmarkStart w:id="66" w:name="_bookmark65"/>
+      <w:bookmarkEnd w:id="66"/>
       <w:r>
         <w:rPr>
           <w:i/>
@@ -35077,7 +34780,7 @@
       </w:pPr>
       <w:r>
         <w:lastRenderedPageBreak/>
-        <w:pict>
+        <w:pict w14:anchorId="5EA1E1A4">
           <v:group id="_x0000_s1192" style="position:absolute;left:0;text-align:left;margin-left:123.25pt;margin-top:26.3pt;width:407.25pt;height:421.05pt;z-index:-15708672;mso-wrap-distance-left:0;mso-wrap-distance-right:0;mso-position-horizontal-relative:page" coordorigin="2465,493" coordsize="8145,8421">
             <v:shape id="_x0000_s1194" type="#_x0000_t75" style="position:absolute;left:2465;top:492;width:8145;height:8421">
               <v:imagedata r:id="rId42" o:title=""/>
@@ -35196,8 +34899,8 @@
           <w:sz w:val="28"/>
         </w:rPr>
       </w:pPr>
-      <w:bookmarkStart w:id="66" w:name="_bookmark66"/>
-      <w:bookmarkEnd w:id="66"/>
+      <w:bookmarkStart w:id="67" w:name="_bookmark66"/>
+      <w:bookmarkEnd w:id="67"/>
       <w:r>
         <w:rPr>
           <w:i/>
@@ -35233,7 +34936,7 @@
       </w:pPr>
       <w:r>
         <w:lastRenderedPageBreak/>
-        <w:pict>
+        <w:pict w14:anchorId="035A49D1">
           <v:group id="_x0000_s1188" style="position:absolute;left:0;text-align:left;margin-left:123pt;margin-top:24.6pt;width:408.5pt;height:567.5pt;z-index:-15707136;mso-wrap-distance-left:0;mso-wrap-distance-right:0;mso-position-horizontal-relative:page" coordorigin="2460,492" coordsize="8170,11350">
             <v:shape id="_x0000_s1191" type="#_x0000_t75" style="position:absolute;left:2460;top:492;width:8170;height:11350">
               <v:imagedata r:id="rId43" o:title=""/>
@@ -35308,8 +35011,8 @@
           <w:sz w:val="28"/>
         </w:rPr>
       </w:pPr>
-      <w:bookmarkStart w:id="67" w:name="_bookmark67"/>
-      <w:bookmarkEnd w:id="67"/>
+      <w:bookmarkStart w:id="68" w:name="_bookmark67"/>
+      <w:bookmarkEnd w:id="68"/>
       <w:r>
         <w:rPr>
           <w:i/>
@@ -35344,7 +35047,7 @@
       </w:pPr>
       <w:r>
         <w:lastRenderedPageBreak/>
-        <w:pict>
+        <w:pict w14:anchorId="39CE865B">
           <v:group id="_x0000_s1185" style="position:absolute;left:0;text-align:left;margin-left:125.3pt;margin-top:24.6pt;width:403.9pt;height:494.8pt;z-index:-15706112;mso-wrap-distance-left:0;mso-wrap-distance-right:0;mso-position-horizontal-relative:page" coordorigin="2506,492" coordsize="8078,9896">
             <v:shape id="_x0000_s1187" type="#_x0000_t75" style="position:absolute;left:2506;top:492;width:8078;height:9896">
               <v:imagedata r:id="rId44" o:title=""/>
@@ -35466,8 +35169,8 @@
           <w:sz w:val="28"/>
         </w:rPr>
       </w:pPr>
-      <w:bookmarkStart w:id="68" w:name="_bookmark68"/>
-      <w:bookmarkEnd w:id="68"/>
+      <w:bookmarkStart w:id="69" w:name="_bookmark68"/>
+      <w:bookmarkEnd w:id="69"/>
       <w:r>
         <w:rPr>
           <w:i/>
@@ -35502,7 +35205,7 @@
       </w:pPr>
       <w:r>
         <w:lastRenderedPageBreak/>
-        <w:pict>
+        <w:pict w14:anchorId="43052A13">
           <v:group id="_x0000_s1181" style="position:absolute;left:0;text-align:left;margin-left:137.5pt;margin-top:24.6pt;width:379.5pt;height:304.5pt;z-index:-15704576;mso-wrap-distance-left:0;mso-wrap-distance-right:0;mso-position-horizontal-relative:page" coordorigin="2750,492" coordsize="7590,6090">
             <v:shape id="_x0000_s1184" type="#_x0000_t75" style="position:absolute;left:2750;top:492;width:7590;height:6090">
               <v:imagedata r:id="rId45" o:title=""/>
@@ -35577,8 +35280,8 @@
           <w:sz w:val="28"/>
         </w:rPr>
       </w:pPr>
-      <w:bookmarkStart w:id="69" w:name="_bookmark69"/>
-      <w:bookmarkEnd w:id="69"/>
+      <w:bookmarkStart w:id="70" w:name="_bookmark69"/>
+      <w:bookmarkEnd w:id="70"/>
       <w:r>
         <w:rPr>
           <w:i/>
@@ -35642,10 +35345,10 @@
           <w:sz w:val="28"/>
         </w:rPr>
       </w:pPr>
-      <w:bookmarkStart w:id="70" w:name="_bookmark70"/>
-      <w:bookmarkEnd w:id="70"/>
-      <w:r>
-        <w:pict>
+      <w:bookmarkStart w:id="71" w:name="_bookmark70"/>
+      <w:bookmarkEnd w:id="71"/>
+      <w:r>
+        <w:pict w14:anchorId="382BECA6">
           <v:group id="_x0000_s1177" style="position:absolute;margin-left:123.05pt;margin-top:15.25pt;width:400.9pt;height:397.9pt;z-index:-15703040;mso-wrap-distance-left:0;mso-wrap-distance-right:0;mso-position-horizontal-relative:page" coordorigin="2536,492" coordsize="8018,7958">
             <v:shape id="_x0000_s1180" type="#_x0000_t75" style="position:absolute;left:2536;top:492;width:8018;height:7958">
               <v:imagedata r:id="rId46" o:title=""/>
@@ -35767,8 +35470,8 @@
           <w:szCs w:val="32"/>
         </w:rPr>
       </w:pPr>
-      <w:bookmarkStart w:id="71" w:name="_bookmark71"/>
-      <w:bookmarkEnd w:id="71"/>
+      <w:bookmarkStart w:id="72" w:name="_bookmark71"/>
+      <w:bookmarkEnd w:id="72"/>
       <w:r>
         <w:rPr>
           <w:sz w:val="32"/>
@@ -35810,7 +35513,7 @@
         </w:rPr>
       </w:pPr>
       <w:r>
-        <w:pict>
+        <w:pict w14:anchorId="08227CAB">
           <v:shape id="_x0000_s1176" type="#_x0000_t202" style="position:absolute;left:0;text-align:left;margin-left:387pt;margin-top:54.15pt;width:34.7pt;height:8.6pt;z-index:-18667520;mso-position-horizontal-relative:page" filled="f" stroked="f">
             <v:textbox style="mso-next-textbox:#_x0000_s1176" inset="0,0,0,0">
               <w:txbxContent>
@@ -35837,7 +35540,7 @@
         </w:pict>
       </w:r>
       <w:r>
-        <w:pict>
+        <w:pict w14:anchorId="2E154FDD">
           <v:shape id="_x0000_s1175" type="#_x0000_t202" style="position:absolute;left:0;text-align:left;margin-left:517.55pt;margin-top:54.15pt;width:36.35pt;height:8.6pt;z-index:-18667008;mso-position-horizontal-relative:page" filled="f" stroked="f">
             <v:textbox style="mso-next-textbox:#_x0000_s1175" inset="0,0,0,0">
               <w:txbxContent>
@@ -35910,7 +35613,7 @@
           <w:lang w:val="en-US"/>
         </w:rPr>
         <w:drawing>
-          <wp:anchor distT="0" distB="0" distL="0" distR="0" simplePos="0" relativeHeight="51" behindDoc="0" locked="0" layoutInCell="1" allowOverlap="1">
+          <wp:anchor distT="0" distB="0" distL="0" distR="0" simplePos="0" relativeHeight="51" behindDoc="0" locked="0" layoutInCell="1" allowOverlap="1" wp14:anchorId="02A59D6B" wp14:editId="2694B3F7">
             <wp:simplePos x="0" y="0"/>
             <wp:positionH relativeFrom="page">
               <wp:posOffset>1402080</wp:posOffset>
@@ -35954,7 +35657,7 @@
         </w:drawing>
       </w:r>
       <w:r>
-        <w:pict>
+        <w:pict w14:anchorId="31C8D703">
           <v:shape id="_x0000_s1174" type="#_x0000_t202" style="position:absolute;margin-left:232.65pt;margin-top:17.85pt;width:55.3pt;height:21.45pt;z-index:-15702016;mso-wrap-distance-left:0;mso-wrap-distance-right:0;mso-position-horizontal-relative:page;mso-position-vertical-relative:text" fillcolor="#ffc" strokecolor="#903" strokeweight=".06853mm">
             <v:textbox style="mso-next-textbox:#_x0000_s1174" inset="0,0,0,0">
               <w:txbxContent>
@@ -35998,7 +35701,7 @@
         </w:pict>
       </w:r>
       <w:r>
-        <w:pict>
+        <w:pict w14:anchorId="00ED5520">
           <v:shape id="_x0000_s1173" type="#_x0000_t202" style="position:absolute;margin-left:375.65pt;margin-top:17.85pt;width:55.35pt;height:21.45pt;z-index:-15701504;mso-wrap-distance-left:0;mso-wrap-distance-right:0;mso-position-horizontal-relative:page;mso-position-vertical-relative:text" fillcolor="#ffc" strokecolor="#903" strokeweight=".06853mm">
             <v:textbox style="mso-next-textbox:#_x0000_s1173" inset="0,0,0,0">
               <w:txbxContent>
@@ -36027,7 +35730,7 @@
         </w:pict>
       </w:r>
       <w:r>
-        <w:pict>
+        <w:pict w14:anchorId="2BE76798">
           <v:shape id="_x0000_s1172" type="#_x0000_t202" style="position:absolute;margin-left:506.7pt;margin-top:17.85pt;width:55.35pt;height:21.45pt;z-index:-15700992;mso-wrap-distance-left:0;mso-wrap-distance-right:0;mso-position-horizontal-relative:page;mso-position-vertical-relative:text" fillcolor="#ffc" strokecolor="#903" strokeweight=".06853mm">
             <v:textbox style="mso-next-textbox:#_x0000_s1172" inset="0,0,0,0">
               <w:txbxContent>
@@ -36099,7 +35802,7 @@
         </w:rPr>
       </w:pPr>
       <w:r>
-        <w:pict>
+        <w:pict w14:anchorId="677E0A2F">
           <v:shape id="_x0000_s1171" type="#_x0000_t202" style="position:absolute;left:0;text-align:left;margin-left:243.8pt;margin-top:-41.05pt;width:35.25pt;height:17.9pt;z-index:-18668032;mso-position-horizontal-relative:page" filled="f" stroked="f">
             <v:textbox style="mso-next-textbox:#_x0000_s1171" inset="0,0,0,0">
               <w:txbxContent>
@@ -36143,7 +35846,7 @@
         </w:pict>
       </w:r>
       <w:r>
-        <w:pict>
+        <w:pict w14:anchorId="69599BDA">
           <v:group id="_x0000_s1147" style="position:absolute;left:0;text-align:left;margin-left:117.65pt;margin-top:-17pt;width:419.35pt;height:224.4pt;z-index:-18666496;mso-position-horizontal-relative:page" coordorigin="2353,-340" coordsize="8387,4488">
             <v:shape id="_x0000_s1170" style="position:absolute;left:2410;top:640;width:2;height:3507" coordorigin="2411,641" coordsize="0,3507" o:spt="100" adj="0,,0" path="m2411,1654r,2493m2411,641r,689e" filled="f" strokeweight=".05658mm">
               <v:stroke dashstyle="1 1" joinstyle="round"/>
@@ -36494,8 +36197,8 @@
           <w:sz w:val="28"/>
         </w:rPr>
       </w:pPr>
-      <w:bookmarkStart w:id="72" w:name="_bookmark72"/>
-      <w:bookmarkEnd w:id="72"/>
+      <w:bookmarkStart w:id="73" w:name="_bookmark72"/>
+      <w:bookmarkEnd w:id="73"/>
       <w:r>
         <w:rPr>
           <w:i/>
@@ -36535,7 +36238,7 @@
           <w:lang w:val="en-US"/>
         </w:rPr>
         <w:drawing>
-          <wp:anchor distT="0" distB="0" distL="0" distR="0" simplePos="0" relativeHeight="55" behindDoc="0" locked="0" layoutInCell="1" allowOverlap="1">
+          <wp:anchor distT="0" distB="0" distL="0" distR="0" simplePos="0" relativeHeight="55" behindDoc="0" locked="0" layoutInCell="1" allowOverlap="1" wp14:anchorId="2DBCFC92" wp14:editId="463248FA">
             <wp:simplePos x="0" y="0"/>
             <wp:positionH relativeFrom="page">
               <wp:posOffset>1397272</wp:posOffset>
@@ -36624,8 +36327,8 @@
           <w:sz w:val="28"/>
         </w:rPr>
       </w:pPr>
-      <w:bookmarkStart w:id="73" w:name="_bookmark73"/>
-      <w:bookmarkEnd w:id="73"/>
+      <w:bookmarkStart w:id="74" w:name="_bookmark73"/>
+      <w:bookmarkEnd w:id="74"/>
       <w:r>
         <w:rPr>
           <w:i/>
@@ -36659,7 +36362,7 @@
       </w:pPr>
       <w:r>
         <w:lastRenderedPageBreak/>
-        <w:pict>
+        <w:pict w14:anchorId="122673CB">
           <v:shape id="_x0000_s1146" type="#_x0000_t202" style="position:absolute;left:0;text-align:left;margin-left:190.25pt;margin-top:50.6pt;width:30.25pt;height:14.5pt;z-index:-18653184;mso-position-horizontal-relative:page" filled="f" stroked="f">
             <v:textbox style="mso-next-textbox:#_x0000_s1146" inset="0,0,0,0">
               <w:txbxContent>
@@ -36695,7 +36398,7 @@
         </w:pict>
       </w:r>
       <w:r>
-        <w:pict>
+        <w:pict w14:anchorId="6834E578">
           <v:shape id="_x0000_s1145" type="#_x0000_t202" style="position:absolute;left:0;text-align:left;margin-left:348.45pt;margin-top:50.6pt;width:32.7pt;height:14.5pt;z-index:-18652672;mso-position-horizontal-relative:page" filled="f" stroked="f">
             <v:textbox style="mso-next-textbox:#_x0000_s1145" inset="0,0,0,0">
               <w:txbxContent>
@@ -36731,7 +36434,7 @@
         </w:pict>
       </w:r>
       <w:r>
-        <w:pict>
+        <w:pict w14:anchorId="50542BAC">
           <v:shape id="_x0000_s1144" type="#_x0000_t202" style="position:absolute;left:0;text-align:left;margin-left:427.25pt;margin-top:50.6pt;width:28.7pt;height:7.25pt;z-index:-18652160;mso-position-horizontal-relative:page" filled="f" stroked="f">
             <v:textbox style="mso-next-textbox:#_x0000_s1144" inset="0,0,0,0">
               <w:txbxContent>
@@ -36766,7 +36469,7 @@
         </w:pict>
       </w:r>
       <w:r>
-        <w:pict>
+        <w:pict w14:anchorId="481C41B9">
           <v:shape id="_x0000_s1143" type="#_x0000_t202" style="position:absolute;left:0;text-align:left;margin-left:523pt;margin-top:50.6pt;width:35.95pt;height:7.25pt;z-index:-18651648;mso-position-horizontal-relative:page" filled="f" stroked="f">
             <v:textbox style="mso-next-textbox:#_x0000_s1143" inset="0,0,0,0">
               <w:txbxContent>
@@ -36801,7 +36504,7 @@
         </w:pict>
       </w:r>
       <w:r>
-        <w:pict>
+        <w:pict w14:anchorId="7F1220AF">
           <v:shape id="_x0000_s1142" type="#_x0000_t202" style="position:absolute;left:0;text-align:left;margin-left:273.3pt;margin-top:50.6pt;width:25.6pt;height:14.5pt;z-index:-18651136;mso-position-horizontal-relative:page" filled="f" stroked="f">
             <v:textbox style="mso-next-textbox:#_x0000_s1142" inset="0,0,0,0">
               <w:txbxContent>
@@ -36872,7 +36575,7 @@
           <w:lang w:val="en-US"/>
         </w:rPr>
         <w:drawing>
-          <wp:anchor distT="0" distB="0" distL="0" distR="0" simplePos="0" relativeHeight="60" behindDoc="0" locked="0" layoutInCell="1" allowOverlap="1">
+          <wp:anchor distT="0" distB="0" distL="0" distR="0" simplePos="0" relativeHeight="60" behindDoc="0" locked="0" layoutInCell="1" allowOverlap="1" wp14:anchorId="757CC88A" wp14:editId="4F2656C9">
             <wp:simplePos x="0" y="0"/>
             <wp:positionH relativeFrom="page">
               <wp:posOffset>1545977</wp:posOffset>
@@ -36933,7 +36636,7 @@
         <w:rPr>
           <w:sz w:val="20"/>
         </w:rPr>
-        <w:pict>
+        <w:pict w14:anchorId="767F2F9C">
           <v:group id="_x0000_s1054" style="width:452pt;height:398.3pt;mso-position-horizontal-relative:char;mso-position-vertical-relative:line" coordsize="9040,7966">
             <v:shape id="_x0000_s1141" style="position:absolute;left:419;top:392;width:2;height:7574" coordorigin="419,392" coordsize="0,7574" o:spt="100" adj="0,,0" path="m419,7163r,802m419,6317r,603m419,5502r,590m419,3428r,1836m419,2051r,1142m419,1637r,189m419,892r,520m419,392r,275e" filled="f" strokeweight=".03933mm">
               <v:stroke dashstyle="1 1" joinstyle="round"/>
@@ -38832,7 +38535,6 @@
                 </w:txbxContent>
               </v:textbox>
             </v:shape>
-            <w10:wrap type="none"/>
             <w10:anchorlock/>
           </v:group>
         </w:pict>
@@ -38848,8 +38550,8 @@
           <w:sz w:val="28"/>
         </w:rPr>
       </w:pPr>
-      <w:bookmarkStart w:id="74" w:name="_bookmark74"/>
-      <w:bookmarkEnd w:id="74"/>
+      <w:bookmarkStart w:id="75" w:name="_bookmark74"/>
+      <w:bookmarkEnd w:id="75"/>
       <w:r>
         <w:rPr>
           <w:i/>
@@ -38912,7 +38614,7 @@
           <w:lang w:val="en-US"/>
         </w:rPr>
         <w:drawing>
-          <wp:anchor distT="0" distB="0" distL="0" distR="0" simplePos="0" relativeHeight="90" behindDoc="0" locked="0" layoutInCell="1" allowOverlap="1">
+          <wp:anchor distT="0" distB="0" distL="0" distR="0" simplePos="0" relativeHeight="90" behindDoc="0" locked="0" layoutInCell="1" allowOverlap="1" wp14:anchorId="08526664" wp14:editId="5C2EC166">
             <wp:simplePos x="0" y="0"/>
             <wp:positionH relativeFrom="page">
               <wp:posOffset>1178927</wp:posOffset>
@@ -38975,8 +38677,8 @@
           <w:sz w:val="28"/>
         </w:rPr>
       </w:pPr>
-      <w:bookmarkStart w:id="75" w:name="_bookmark75"/>
-      <w:bookmarkEnd w:id="75"/>
+      <w:bookmarkStart w:id="76" w:name="_bookmark75"/>
+      <w:bookmarkEnd w:id="76"/>
       <w:r>
         <w:rPr>
           <w:i/>
@@ -38998,7 +38700,7 @@
         <w:spacing w:before="201"/>
       </w:pPr>
       <w:r>
-        <w:pict>
+        <w:pict w14:anchorId="08BE534E">
           <v:shape id="_x0000_s1053" style="position:absolute;left:0;text-align:left;margin-left:377.45pt;margin-top:82.6pt;width:.55pt;height:35pt;z-index:15779840;mso-position-horizontal-relative:page" coordorigin="7549,1652" coordsize="11,700" path="m7560,1652r-11,l7549,2352r11,-6l7560,1652xe" fillcolor="black" stroked="f">
             <v:path arrowok="t"/>
             <w10:wrap anchorx="page"/>
@@ -39028,18 +38730,28 @@
         </w:rPr>
       </w:pPr>
       <w:r>
+        <w:pict w14:anchorId="5FC38796">
+          <v:shape id="_x0000_s1052" style="position:absolute;margin-left:269.3pt;margin-top:22.65pt;width:31.2pt;height:20.3pt;z-index:-15681536;mso-wrap-distance-left:0;mso-wrap-distance-right:0;mso-position-horizontal-relative:page;mso-position-vertical-relative:text" coordorigin="4681,475" coordsize="624,406" o:spt="100" adj="0,,0" path="m5304,678r,-5l5304,668r-1,-5l5303,657r-2,-9l5300,637r-3,-9l5295,618r-4,-9l5287,599r-4,-9l5278,581r-4,-8l5268,565r-5,-8l5256,549r-6,-7l5243,535r-7,-7l5228,521r-7,-5l5212,510r-8,-5l5195,500r-9,-5l5177,491r-10,-3l5158,484r-10,-3l5143,481r-5,-2l5133,478r-5,l5123,477r-5,-1l5112,476r-5,-1l5102,475r-6,l5091,475r-6,l5080,476r-5,l5070,477r-5,1l5059,478r-5,1l5049,481r-5,l5034,484r-9,4l5015,491r-9,4l4997,500r-9,5l4980,510r-9,6l4964,521r-7,7l4949,535r-6,7l4936,549r-7,8l4924,565r-5,8l4914,581r-5,9l4905,599r-4,10l4898,618r-3,10l4893,637r-2,10l4890,657r-1,6l4889,668r,5l4889,678r,5l4889,688r,6l4890,699r1,10l4893,719r2,10l4898,738r3,10l4905,757r4,9l4914,775r5,9l4924,792r5,8l4936,807r7,7l4949,822r8,6l4964,835r7,6l4980,846r8,5l4997,857r9,4l5015,865r10,4l5034,872r10,3l5049,876r5,1l5059,878r6,1l5070,880r5,l5080,881r5,l5091,881r5,l5102,881r5,l5112,881r6,-1l5123,880r5,-1l5133,878r5,-1l5143,876r5,-1l5158,872r9,-3l5177,865r9,-4l5195,857r9,-6l5212,846r9,-5l5228,835r8,-7l5243,822r7,-8l5256,807r7,-7l5268,792r6,-8l5278,775r5,-9l5287,757r4,-9l5295,738r2,-9l5299,719r2,-10l5302,704r1,-5l5303,694r1,-6l5304,683r,-5m4889,675r-208,m4681,516r,325e" filled="f" strokeweight=".0345mm">
+            <v:stroke joinstyle="round"/>
+            <v:formulas/>
+            <v:path arrowok="t" o:connecttype="segments"/>
+            <w10:wrap type="topAndBottom" anchorx="page"/>
+          </v:shape>
+        </w:pict>
+      </w:r>
+      <w:r>
         <w:rPr>
           <w:noProof/>
           <w:lang w:val="en-US"/>
         </w:rPr>
         <w:drawing>
-          <wp:anchor distT="0" distB="0" distL="0" distR="0" simplePos="0" relativeHeight="91" behindDoc="0" locked="0" layoutInCell="1" allowOverlap="1">
+          <wp:anchor distT="0" distB="0" distL="0" distR="0" simplePos="0" relativeHeight="251658240" behindDoc="0" locked="0" layoutInCell="1" allowOverlap="1" wp14:anchorId="088E845F" wp14:editId="08B36C8A">
             <wp:simplePos x="0" y="0"/>
             <wp:positionH relativeFrom="page">
-              <wp:posOffset>1363511</wp:posOffset>
+              <wp:posOffset>1915547</wp:posOffset>
             </wp:positionH>
             <wp:positionV relativeFrom="paragraph">
-              <wp:posOffset>202864</wp:posOffset>
+              <wp:posOffset>238191</wp:posOffset>
             </wp:positionV>
             <wp:extent cx="186470" cy="376237"/>
             <wp:effectExtent l="0" t="0" r="0" b="0"/>
@@ -39077,17 +38789,7 @@
         </w:drawing>
       </w:r>
       <w:r>
-        <w:pict>
-          <v:shape id="_x0000_s1052" style="position:absolute;margin-left:234.05pt;margin-top:23.75pt;width:31.2pt;height:20.3pt;z-index:-15681536;mso-wrap-distance-left:0;mso-wrap-distance-right:0;mso-position-horizontal-relative:page;mso-position-vertical-relative:text" coordorigin="4681,475" coordsize="624,406" o:spt="100" adj="0,,0" path="m5304,678r,-5l5304,668r-1,-5l5303,657r-2,-9l5300,637r-3,-9l5295,618r-4,-9l5287,599r-4,-9l5278,581r-4,-8l5268,565r-5,-8l5256,549r-6,-7l5243,535r-7,-7l5228,521r-7,-5l5212,510r-8,-5l5195,500r-9,-5l5177,491r-10,-3l5158,484r-10,-3l5143,481r-5,-2l5133,478r-5,l5123,477r-5,-1l5112,476r-5,-1l5102,475r-6,l5091,475r-6,l5080,476r-5,l5070,477r-5,1l5059,478r-5,1l5049,481r-5,l5034,484r-9,4l5015,491r-9,4l4997,500r-9,5l4980,510r-9,6l4964,521r-7,7l4949,535r-6,7l4936,549r-7,8l4924,565r-5,8l4914,581r-5,9l4905,599r-4,10l4898,618r-3,10l4893,637r-2,10l4890,657r-1,6l4889,668r,5l4889,678r,5l4889,688r,6l4890,699r1,10l4893,719r2,10l4898,738r3,10l4905,757r4,9l4914,775r5,9l4924,792r5,8l4936,807r7,7l4949,822r8,6l4964,835r7,6l4980,846r8,5l4997,857r9,4l5015,865r10,4l5034,872r10,3l5049,876r5,1l5059,878r6,1l5070,880r5,l5080,881r5,l5091,881r5,l5102,881r5,l5112,881r6,-1l5123,880r5,-1l5133,878r5,-1l5143,876r5,-1l5158,872r9,-3l5177,865r9,-4l5195,857r9,-6l5212,846r9,-5l5228,835r8,-7l5243,822r7,-8l5256,807r7,-7l5268,792r6,-8l5278,775r5,-9l5287,757r4,-9l5295,738r2,-9l5299,719r2,-10l5302,704r1,-5l5303,694r1,-6l5304,683r,-5m4889,675r-208,m4681,516r,325e" filled="f" strokeweight=".0345mm">
-            <v:stroke joinstyle="round"/>
-            <v:formulas/>
-            <v:path arrowok="t" o:connecttype="segments"/>
-            <w10:wrap type="topAndBottom" anchorx="page"/>
-          </v:shape>
-        </w:pict>
-      </w:r>
-      <w:r>
-        <w:pict>
+        <w:pict w14:anchorId="6B358039">
           <v:shape id="_x0000_s1051" style="position:absolute;margin-left:367.3pt;margin-top:21.6pt;width:19.8pt;height:22.5pt;z-index:-15681024;mso-wrap-distance-left:0;mso-wrap-distance-right:0;mso-position-horizontal-relative:page;mso-position-vertical-relative:text" coordorigin="7346,432" coordsize="396,450" o:spt="100" adj="0,,0" path="m7742,677r,-5l7741,667r,-6l7741,656r-2,-10l7738,636r-3,-10l7733,616r-3,-10l7726,597r-4,-9l7718,579r-5,-8l7708,562r-6,-7l7696,547r-6,-7l7683,532r-6,-6l7670,519r-8,-6l7654,507r-8,-5l7638,497r-9,-5l7621,489r-9,-4l7603,482r-10,-3l7589,478r-6,-1l7578,476r-4,-1l7569,474r-5,-1l7559,473r-5,l7549,472r-5,l7538,472r-4,1l7529,473r-5,l7519,475r-5,l7509,476r-5,1l7499,478r-4,1l7485,482r-9,3l7467,489r-9,3l7449,497r-8,5l7433,507r-8,6l7418,519r-7,7l7404,532r-7,8l7391,547r-6,7l7380,562r-5,9l7370,579r-5,9l7361,597r-3,9l7355,616r-3,10l7350,636r-2,10l7347,656r-1,5l7346,667r,5l7346,677r,5l7346,688r,5l7347,697r1,11l7350,718r2,10l7355,738r3,9l7361,756r4,10l7370,774r5,9l7380,791r5,8l7391,807r6,7l7404,821r7,7l7418,835r7,6l7433,846r8,6l7449,856r9,5l7467,865r9,4l7485,872r10,3l7499,876r5,1l7509,878r5,1l7519,880r5,l7529,881r5,l7538,881r6,l7549,881r5,l7559,881r5,-1l7569,880r5,-1l7578,878r5,-1l7589,876r4,-1l7603,872r9,-3l7621,865r8,-4l7638,856r8,-4l7654,846r8,-5l7670,835r7,-7l7683,822r7,-8l7696,807r6,-8l7708,791r5,-8l7718,774r4,-8l7726,756r4,-9l7733,738r2,-10l7737,718r2,-10l7740,703r,-6l7741,693r,-5l7741,682r,-5m7603,513r-59,-41l7603,432e" filled="f" strokeweight=".0345mm">
             <v:stroke joinstyle="round"/>
             <v:formulas/>
@@ -39179,8 +38881,9 @@
           <w:spacing w:val="-3"/>
           <w:position w:val="1"/>
           <w:sz w:val="12"/>
-        </w:rPr>
-        <w:tab/>
+          <w:lang w:val="en-US"/>
+        </w:rPr>
+        <w:t xml:space="preserve">                             </w:t>
       </w:r>
       <w:r>
         <w:rPr>
@@ -39232,7 +38935,7 @@
           <w:rFonts w:ascii="Tahoma"/>
           <w:sz w:val="20"/>
         </w:rPr>
-        <w:pict>
+        <w:pict w14:anchorId="4E48BDB0">
           <v:group id="_x0000_s1026" style="width:210.75pt;height:177.1pt;mso-position-horizontal-relative:char;mso-position-vertical-relative:line" coordsize="4215,3542">
             <v:shape id="_x0000_s1050" style="position:absolute;left:76;width:2710;height:3542" coordorigin="76" coordsize="2710,3542" o:spt="100" adj="0,,0" path="m87,3416r-11,l76,3542r11,l87,3416xm87,11r-11,l76,3123r11,l87,11xm2786,r-11,l2775,511r11,l2786,xe" fillcolor="black" stroked="f">
               <v:stroke joinstyle="round"/>
@@ -39582,7 +39285,6 @@
                 </w:txbxContent>
               </v:textbox>
             </v:shape>
-            <w10:wrap type="none"/>
             <w10:anchorlock/>
           </v:group>
         </w:pict>
@@ -39607,8 +39309,8 @@
           <w:sz w:val="28"/>
         </w:rPr>
       </w:pPr>
-      <w:bookmarkStart w:id="76" w:name="_bookmark76"/>
-      <w:bookmarkEnd w:id="76"/>
+      <w:bookmarkStart w:id="77" w:name="_bookmark76"/>
+      <w:bookmarkEnd w:id="77"/>
       <w:r>
         <w:rPr>
           <w:i/>
@@ -39671,7 +39373,7 @@
           <w:lang w:val="en-US"/>
         </w:rPr>
         <w:drawing>
-          <wp:anchor distT="0" distB="0" distL="0" distR="0" simplePos="0" relativeHeight="101" behindDoc="0" locked="0" layoutInCell="1" allowOverlap="1">
+          <wp:anchor distT="0" distB="0" distL="0" distR="0" simplePos="0" relativeHeight="101" behindDoc="0" locked="0" layoutInCell="1" allowOverlap="1" wp14:anchorId="57A1E938" wp14:editId="797CF2D7">
             <wp:simplePos x="0" y="0"/>
             <wp:positionH relativeFrom="page">
               <wp:posOffset>1100424</wp:posOffset>
@@ -39725,8 +39427,8 @@
           <w:sz w:val="28"/>
         </w:rPr>
       </w:pPr>
-      <w:bookmarkStart w:id="77" w:name="_bookmark77"/>
-      <w:bookmarkEnd w:id="77"/>
+      <w:bookmarkStart w:id="78" w:name="_bookmark77"/>
+      <w:bookmarkEnd w:id="78"/>
       <w:r>
         <w:rPr>
           <w:i/>
@@ -39766,7 +39468,7 @@
         </w:rPr>
         <w:lastRenderedPageBreak/>
         <w:drawing>
-          <wp:anchor distT="0" distB="0" distL="0" distR="0" simplePos="0" relativeHeight="102" behindDoc="0" locked="0" layoutInCell="1" allowOverlap="1">
+          <wp:anchor distT="0" distB="0" distL="0" distR="0" simplePos="0" relativeHeight="102" behindDoc="0" locked="0" layoutInCell="1" allowOverlap="1" wp14:anchorId="497D18B7" wp14:editId="5F2A1300">
             <wp:simplePos x="0" y="0"/>
             <wp:positionH relativeFrom="page">
               <wp:posOffset>1080135</wp:posOffset>
@@ -39832,8 +39534,8 @@
           <w:sz w:val="28"/>
         </w:rPr>
       </w:pPr>
-      <w:bookmarkStart w:id="78" w:name="_bookmark78"/>
-      <w:bookmarkEnd w:id="78"/>
+      <w:bookmarkStart w:id="79" w:name="_bookmark78"/>
+      <w:bookmarkEnd w:id="79"/>
       <w:r>
         <w:rPr>
           <w:i/>
@@ -39873,7 +39575,7 @@
         </w:rPr>
         <w:lastRenderedPageBreak/>
         <w:drawing>
-          <wp:anchor distT="0" distB="0" distL="0" distR="0" simplePos="0" relativeHeight="103" behindDoc="0" locked="0" layoutInCell="1" allowOverlap="1">
+          <wp:anchor distT="0" distB="0" distL="0" distR="0" simplePos="0" relativeHeight="103" behindDoc="0" locked="0" layoutInCell="1" allowOverlap="1" wp14:anchorId="6C27BDC4" wp14:editId="4BA7EF14">
             <wp:simplePos x="0" y="0"/>
             <wp:positionH relativeFrom="page">
               <wp:posOffset>1080135</wp:posOffset>
@@ -39938,23 +39640,14 @@
           <w:sz w:val="28"/>
         </w:rPr>
       </w:pPr>
-      <w:bookmarkStart w:id="79" w:name="_bookmark79"/>
-      <w:bookmarkEnd w:id="79"/>
+      <w:bookmarkStart w:id="80" w:name="_bookmark79"/>
+      <w:bookmarkEnd w:id="80"/>
       <w:r>
         <w:rPr>
           <w:i/>
           <w:sz w:val="28"/>
         </w:rPr>
-        <w:t>Hìn</w:t>
-      </w:r>
-      <w:bookmarkStart w:id="80" w:name="_GoBack"/>
-      <w:bookmarkEnd w:id="80"/>
-      <w:r>
-        <w:rPr>
-          <w:i/>
-          <w:sz w:val="28"/>
-        </w:rPr>
-        <w:t>h 2.6.8: Biểu đồ trình tự quản lý nhà cung cấp</w:t>
+        <w:t>Hình 2.6.8: Biểu đồ trình tự quản lý nhà cung cấp</w:t>
       </w:r>
     </w:p>
     <w:p>
@@ -40045,7 +39738,7 @@
           <w:lang w:val="en-US"/>
         </w:rPr>
         <w:drawing>
-          <wp:anchor distT="0" distB="0" distL="114300" distR="114300" simplePos="0" relativeHeight="251660288" behindDoc="0" locked="0" layoutInCell="1" allowOverlap="1" wp14:anchorId="7D845384" wp14:editId="5884F6B9">
+          <wp:anchor distT="0" distB="0" distL="114300" distR="114300" simplePos="0" relativeHeight="251660288" behindDoc="0" locked="0" layoutInCell="1" allowOverlap="1" wp14:anchorId="048BBB3E" wp14:editId="7F9AFF5A">
             <wp:simplePos x="0" y="0"/>
             <wp:positionH relativeFrom="column">
               <wp:posOffset>190500</wp:posOffset>
@@ -48062,7 +47755,7 @@
 </file>
 
 <file path=word/endnotes.xml><?xml version="1.0" encoding="utf-8"?>
-<w:endnotes xmlns:wpc="http://schemas.microsoft.com/office/word/2010/wordprocessingCanvas" xmlns:cx="http://schemas.microsoft.com/office/drawing/2014/chartex" xmlns:mc="http://schemas.openxmlformats.org/markup-compatibility/2006" xmlns:o="urn:schemas-microsoft-com:office:office" xmlns:r="http://schemas.openxmlformats.org/officeDocument/2006/relationships" xmlns:m="http://schemas.openxmlformats.org/officeDocument/2006/math" xmlns:v="urn:schemas-microsoft-com:vml" xmlns:wp14="http://schemas.microsoft.com/office/word/2010/wordprocessingDrawing" xmlns:wp="http://schemas.openxmlformats.org/drawingml/2006/wordprocessingDrawing" xmlns:w10="urn:schemas-microsoft-com:office:word" xmlns:w="http://schemas.openxmlformats.org/wordprocessingml/2006/main" xmlns:w14="http://schemas.microsoft.com/office/word/2010/wordml" xmlns:w15="http://schemas.microsoft.com/office/word/2012/wordml" xmlns:w16se="http://schemas.microsoft.com/office/word/2015/wordml/symex" xmlns:wpg="http://schemas.microsoft.com/office/word/2010/wordprocessingGroup" xmlns:wpi="http://schemas.microsoft.com/office/word/2010/wordprocessingInk" xmlns:wne="http://schemas.microsoft.com/office/word/2006/wordml" xmlns:wps="http://schemas.microsoft.com/office/word/2010/wordprocessingShape" mc:Ignorable="w14 w15 w16se wp14">
+<w:endnotes xmlns:wpc="http://schemas.microsoft.com/office/word/2010/wordprocessingCanvas" xmlns:cx="http://schemas.microsoft.com/office/drawing/2014/chartex" xmlns:cx1="http://schemas.microsoft.com/office/drawing/2015/9/8/chartex" xmlns:cx2="http://schemas.microsoft.com/office/drawing/2015/10/21/chartex" xmlns:cx3="http://schemas.microsoft.com/office/drawing/2016/5/9/chartex" xmlns:cx4="http://schemas.microsoft.com/office/drawing/2016/5/10/chartex" xmlns:cx5="http://schemas.microsoft.com/office/drawing/2016/5/11/chartex" xmlns:cx6="http://schemas.microsoft.com/office/drawing/2016/5/12/chartex" xmlns:cx7="http://schemas.microsoft.com/office/drawing/2016/5/13/chartex" xmlns:cx8="http://schemas.microsoft.com/office/drawing/2016/5/14/chartex" xmlns:mc="http://schemas.openxmlformats.org/markup-compatibility/2006" xmlns:aink="http://schemas.microsoft.com/office/drawing/2016/ink" xmlns:am3d="http://schemas.microsoft.com/office/drawing/2017/model3d" xmlns:o="urn:schemas-microsoft-com:office:office" xmlns:r="http://schemas.openxmlformats.org/officeDocument/2006/relationships" xmlns:m="http://schemas.openxmlformats.org/officeDocument/2006/math" xmlns:v="urn:schemas-microsoft-com:vml" xmlns:wp14="http://schemas.microsoft.com/office/word/2010/wordprocessingDrawing" xmlns:wp="http://schemas.openxmlformats.org/drawingml/2006/wordprocessingDrawing" xmlns:w10="urn:schemas-microsoft-com:office:word" xmlns:w="http://schemas.openxmlformats.org/wordprocessingml/2006/main" xmlns:w14="http://schemas.microsoft.com/office/word/2010/wordml" xmlns:w15="http://schemas.microsoft.com/office/word/2012/wordml" xmlns:w16cex="http://schemas.microsoft.com/office/word/2018/wordml/cex" xmlns:w16cid="http://schemas.microsoft.com/office/word/2016/wordml/cid" xmlns:w16="http://schemas.microsoft.com/office/word/2018/wordml" xmlns:w16se="http://schemas.microsoft.com/office/word/2015/wordml/symex" xmlns:wpg="http://schemas.microsoft.com/office/word/2010/wordprocessingGroup" xmlns:wpi="http://schemas.microsoft.com/office/word/2010/wordprocessingInk" xmlns:wne="http://schemas.microsoft.com/office/word/2006/wordml" xmlns:wps="http://schemas.microsoft.com/office/word/2010/wordprocessingShape" mc:Ignorable="w14 w15 w16se w16cid w16 w16cex wp14">
   <w:endnote w:type="separator" w:id="-1">
     <w:p>
       <w:r>
@@ -48081,7 +47774,7 @@
 </file>
 
 <file path=word/footer1.xml><?xml version="1.0" encoding="utf-8"?>
-<w:ftr xmlns:wpc="http://schemas.microsoft.com/office/word/2010/wordprocessingCanvas" xmlns:cx="http://schemas.microsoft.com/office/drawing/2014/chartex" xmlns:mc="http://schemas.openxmlformats.org/markup-compatibility/2006" xmlns:o="urn:schemas-microsoft-com:office:office" xmlns:r="http://schemas.openxmlformats.org/officeDocument/2006/relationships" xmlns:m="http://schemas.openxmlformats.org/officeDocument/2006/math" xmlns:v="urn:schemas-microsoft-com:vml" xmlns:wp14="http://schemas.microsoft.com/office/word/2010/wordprocessingDrawing" xmlns:wp="http://schemas.openxmlformats.org/drawingml/2006/wordprocessingDrawing" xmlns:w10="urn:schemas-microsoft-com:office:word" xmlns:w="http://schemas.openxmlformats.org/wordprocessingml/2006/main" xmlns:w14="http://schemas.microsoft.com/office/word/2010/wordml" xmlns:w15="http://schemas.microsoft.com/office/word/2012/wordml" xmlns:w16se="http://schemas.microsoft.com/office/word/2015/wordml/symex" xmlns:wpg="http://schemas.microsoft.com/office/word/2010/wordprocessingGroup" xmlns:wpi="http://schemas.microsoft.com/office/word/2010/wordprocessingInk" xmlns:wne="http://schemas.microsoft.com/office/word/2006/wordml" xmlns:wps="http://schemas.microsoft.com/office/word/2010/wordprocessingShape" mc:Ignorable="w14 w15 w16se wp14">
+<w:ftr xmlns:wpc="http://schemas.microsoft.com/office/word/2010/wordprocessingCanvas" xmlns:cx="http://schemas.microsoft.com/office/drawing/2014/chartex" xmlns:cx1="http://schemas.microsoft.com/office/drawing/2015/9/8/chartex" xmlns:cx2="http://schemas.microsoft.com/office/drawing/2015/10/21/chartex" xmlns:cx3="http://schemas.microsoft.com/office/drawing/2016/5/9/chartex" xmlns:cx4="http://schemas.microsoft.com/office/drawing/2016/5/10/chartex" xmlns:cx5="http://schemas.microsoft.com/office/drawing/2016/5/11/chartex" xmlns:cx6="http://schemas.microsoft.com/office/drawing/2016/5/12/chartex" xmlns:cx7="http://schemas.microsoft.com/office/drawing/2016/5/13/chartex" xmlns:cx8="http://schemas.microsoft.com/office/drawing/2016/5/14/chartex" xmlns:mc="http://schemas.openxmlformats.org/markup-compatibility/2006" xmlns:aink="http://schemas.microsoft.com/office/drawing/2016/ink" xmlns:am3d="http://schemas.microsoft.com/office/drawing/2017/model3d" xmlns:o="urn:schemas-microsoft-com:office:office" xmlns:r="http://schemas.openxmlformats.org/officeDocument/2006/relationships" xmlns:m="http://schemas.openxmlformats.org/officeDocument/2006/math" xmlns:v="urn:schemas-microsoft-com:vml" xmlns:wp14="http://schemas.microsoft.com/office/word/2010/wordprocessingDrawing" xmlns:wp="http://schemas.openxmlformats.org/drawingml/2006/wordprocessingDrawing" xmlns:w10="urn:schemas-microsoft-com:office:word" xmlns:w="http://schemas.openxmlformats.org/wordprocessingml/2006/main" xmlns:w14="http://schemas.microsoft.com/office/word/2010/wordml" xmlns:w15="http://schemas.microsoft.com/office/word/2012/wordml" xmlns:w16cex="http://schemas.microsoft.com/office/word/2018/wordml/cex" xmlns:w16cid="http://schemas.microsoft.com/office/word/2016/wordml/cid" xmlns:w16="http://schemas.microsoft.com/office/word/2018/wordml" xmlns:w16se="http://schemas.microsoft.com/office/word/2015/wordml/symex" xmlns:wpg="http://schemas.microsoft.com/office/word/2010/wordprocessingGroup" xmlns:wpi="http://schemas.microsoft.com/office/word/2010/wordprocessingInk" xmlns:wne="http://schemas.microsoft.com/office/word/2006/wordml" xmlns:wps="http://schemas.microsoft.com/office/word/2010/wordprocessingShape" mc:Ignorable="w14 w15 w16se w16cid w16 w16cex wp14">
   <w:p>
     <w:pPr>
       <w:pStyle w:val="BodyText"/>
@@ -48091,7 +47784,7 @@
       </w:rPr>
     </w:pPr>
     <w:r>
-      <w:pict>
+      <w:pict w14:anchorId="09CCF253">
         <v:shapetype id="_x0000_t202" coordsize="21600,21600" o:spt="202" path="m,l,21600r21600,l21600,xe">
           <v:stroke joinstyle="miter"/>
           <v:path gradientshapeok="t" o:connecttype="rect"/>
@@ -48141,7 +47834,7 @@
 </file>
 
 <file path=word/footer2.xml><?xml version="1.0" encoding="utf-8"?>
-<w:ftr xmlns:wpc="http://schemas.microsoft.com/office/word/2010/wordprocessingCanvas" xmlns:cx="http://schemas.microsoft.com/office/drawing/2014/chartex" xmlns:mc="http://schemas.openxmlformats.org/markup-compatibility/2006" xmlns:o="urn:schemas-microsoft-com:office:office" xmlns:r="http://schemas.openxmlformats.org/officeDocument/2006/relationships" xmlns:m="http://schemas.openxmlformats.org/officeDocument/2006/math" xmlns:v="urn:schemas-microsoft-com:vml" xmlns:wp14="http://schemas.microsoft.com/office/word/2010/wordprocessingDrawing" xmlns:wp="http://schemas.openxmlformats.org/drawingml/2006/wordprocessingDrawing" xmlns:w10="urn:schemas-microsoft-com:office:word" xmlns:w="http://schemas.openxmlformats.org/wordprocessingml/2006/main" xmlns:w14="http://schemas.microsoft.com/office/word/2010/wordml" xmlns:w15="http://schemas.microsoft.com/office/word/2012/wordml" xmlns:w16se="http://schemas.microsoft.com/office/word/2015/wordml/symex" xmlns:wpg="http://schemas.microsoft.com/office/word/2010/wordprocessingGroup" xmlns:wpi="http://schemas.microsoft.com/office/word/2010/wordprocessingInk" xmlns:wne="http://schemas.microsoft.com/office/word/2006/wordml" xmlns:wps="http://schemas.microsoft.com/office/word/2010/wordprocessingShape" mc:Ignorable="w14 w15 w16se wp14">
+<w:ftr xmlns:wpc="http://schemas.microsoft.com/office/word/2010/wordprocessingCanvas" xmlns:cx="http://schemas.microsoft.com/office/drawing/2014/chartex" xmlns:cx1="http://schemas.microsoft.com/office/drawing/2015/9/8/chartex" xmlns:cx2="http://schemas.microsoft.com/office/drawing/2015/10/21/chartex" xmlns:cx3="http://schemas.microsoft.com/office/drawing/2016/5/9/chartex" xmlns:cx4="http://schemas.microsoft.com/office/drawing/2016/5/10/chartex" xmlns:cx5="http://schemas.microsoft.com/office/drawing/2016/5/11/chartex" xmlns:cx6="http://schemas.microsoft.com/office/drawing/2016/5/12/chartex" xmlns:cx7="http://schemas.microsoft.com/office/drawing/2016/5/13/chartex" xmlns:cx8="http://schemas.microsoft.com/office/drawing/2016/5/14/chartex" xmlns:mc="http://schemas.openxmlformats.org/markup-compatibility/2006" xmlns:aink="http://schemas.microsoft.com/office/drawing/2016/ink" xmlns:am3d="http://schemas.microsoft.com/office/drawing/2017/model3d" xmlns:o="urn:schemas-microsoft-com:office:office" xmlns:r="http://schemas.openxmlformats.org/officeDocument/2006/relationships" xmlns:m="http://schemas.openxmlformats.org/officeDocument/2006/math" xmlns:v="urn:schemas-microsoft-com:vml" xmlns:wp14="http://schemas.microsoft.com/office/word/2010/wordprocessingDrawing" xmlns:wp="http://schemas.openxmlformats.org/drawingml/2006/wordprocessingDrawing" xmlns:w10="urn:schemas-microsoft-com:office:word" xmlns:w="http://schemas.openxmlformats.org/wordprocessingml/2006/main" xmlns:w14="http://schemas.microsoft.com/office/word/2010/wordml" xmlns:w15="http://schemas.microsoft.com/office/word/2012/wordml" xmlns:w16cex="http://schemas.microsoft.com/office/word/2018/wordml/cex" xmlns:w16cid="http://schemas.microsoft.com/office/word/2016/wordml/cid" xmlns:w16="http://schemas.microsoft.com/office/word/2018/wordml" xmlns:w16se="http://schemas.microsoft.com/office/word/2015/wordml/symex" xmlns:wpg="http://schemas.microsoft.com/office/word/2010/wordprocessingGroup" xmlns:wpi="http://schemas.microsoft.com/office/word/2010/wordprocessingInk" xmlns:wne="http://schemas.microsoft.com/office/word/2006/wordml" xmlns:wps="http://schemas.microsoft.com/office/word/2010/wordprocessingShape" mc:Ignorable="w14 w15 w16se w16cid w16 w16cex wp14">
   <w:p>
     <w:pPr>
       <w:pStyle w:val="BodyText"/>
@@ -48151,7 +47844,7 @@
       </w:rPr>
     </w:pPr>
     <w:r>
-      <w:pict>
+      <w:pict w14:anchorId="16791AAB">
         <v:shapetype id="_x0000_t202" coordsize="21600,21600" o:spt="202" path="m,l,21600r21600,l21600,xe">
           <v:stroke joinstyle="miter"/>
           <v:path gradientshapeok="t" o:connecttype="rect"/>
@@ -48201,7 +47894,7 @@
 </file>
 
 <file path=word/footer3.xml><?xml version="1.0" encoding="utf-8"?>
-<w:ftr xmlns:wpc="http://schemas.microsoft.com/office/word/2010/wordprocessingCanvas" xmlns:cx="http://schemas.microsoft.com/office/drawing/2014/chartex" xmlns:mc="http://schemas.openxmlformats.org/markup-compatibility/2006" xmlns:o="urn:schemas-microsoft-com:office:office" xmlns:r="http://schemas.openxmlformats.org/officeDocument/2006/relationships" xmlns:m="http://schemas.openxmlformats.org/officeDocument/2006/math" xmlns:v="urn:schemas-microsoft-com:vml" xmlns:wp14="http://schemas.microsoft.com/office/word/2010/wordprocessingDrawing" xmlns:wp="http://schemas.openxmlformats.org/drawingml/2006/wordprocessingDrawing" xmlns:w10="urn:schemas-microsoft-com:office:word" xmlns:w="http://schemas.openxmlformats.org/wordprocessingml/2006/main" xmlns:w14="http://schemas.microsoft.com/office/word/2010/wordml" xmlns:w15="http://schemas.microsoft.com/office/word/2012/wordml" xmlns:w16se="http://schemas.microsoft.com/office/word/2015/wordml/symex" xmlns:wpg="http://schemas.microsoft.com/office/word/2010/wordprocessingGroup" xmlns:wpi="http://schemas.microsoft.com/office/word/2010/wordprocessingInk" xmlns:wne="http://schemas.microsoft.com/office/word/2006/wordml" xmlns:wps="http://schemas.microsoft.com/office/word/2010/wordprocessingShape" mc:Ignorable="w14 w15 w16se wp14">
+<w:ftr xmlns:wpc="http://schemas.microsoft.com/office/word/2010/wordprocessingCanvas" xmlns:cx="http://schemas.microsoft.com/office/drawing/2014/chartex" xmlns:cx1="http://schemas.microsoft.com/office/drawing/2015/9/8/chartex" xmlns:cx2="http://schemas.microsoft.com/office/drawing/2015/10/21/chartex" xmlns:cx3="http://schemas.microsoft.com/office/drawing/2016/5/9/chartex" xmlns:cx4="http://schemas.microsoft.com/office/drawing/2016/5/10/chartex" xmlns:cx5="http://schemas.microsoft.com/office/drawing/2016/5/11/chartex" xmlns:cx6="http://schemas.microsoft.com/office/drawing/2016/5/12/chartex" xmlns:cx7="http://schemas.microsoft.com/office/drawing/2016/5/13/chartex" xmlns:cx8="http://schemas.microsoft.com/office/drawing/2016/5/14/chartex" xmlns:mc="http://schemas.openxmlformats.org/markup-compatibility/2006" xmlns:aink="http://schemas.microsoft.com/office/drawing/2016/ink" xmlns:am3d="http://schemas.microsoft.com/office/drawing/2017/model3d" xmlns:o="urn:schemas-microsoft-com:office:office" xmlns:r="http://schemas.openxmlformats.org/officeDocument/2006/relationships" xmlns:m="http://schemas.openxmlformats.org/officeDocument/2006/math" xmlns:v="urn:schemas-microsoft-com:vml" xmlns:wp14="http://schemas.microsoft.com/office/word/2010/wordprocessingDrawing" xmlns:wp="http://schemas.openxmlformats.org/drawingml/2006/wordprocessingDrawing" xmlns:w10="urn:schemas-microsoft-com:office:word" xmlns:w="http://schemas.openxmlformats.org/wordprocessingml/2006/main" xmlns:w14="http://schemas.microsoft.com/office/word/2010/wordml" xmlns:w15="http://schemas.microsoft.com/office/word/2012/wordml" xmlns:w16cex="http://schemas.microsoft.com/office/word/2018/wordml/cex" xmlns:w16cid="http://schemas.microsoft.com/office/word/2016/wordml/cid" xmlns:w16="http://schemas.microsoft.com/office/word/2018/wordml" xmlns:w16se="http://schemas.microsoft.com/office/word/2015/wordml/symex" xmlns:wpg="http://schemas.microsoft.com/office/word/2010/wordprocessingGroup" xmlns:wpi="http://schemas.microsoft.com/office/word/2010/wordprocessingInk" xmlns:wne="http://schemas.microsoft.com/office/word/2006/wordml" xmlns:wps="http://schemas.microsoft.com/office/word/2010/wordprocessingShape" mc:Ignorable="w14 w15 w16se w16cid w16 w16cex wp14">
   <w:p>
     <w:pPr>
       <w:pStyle w:val="BodyText"/>
@@ -48215,7 +47908,7 @@
 </file>
 
 <file path=word/footnotes.xml><?xml version="1.0" encoding="utf-8"?>
-<w:footnotes xmlns:wpc="http://schemas.microsoft.com/office/word/2010/wordprocessingCanvas" xmlns:cx="http://schemas.microsoft.com/office/drawing/2014/chartex" xmlns:mc="http://schemas.openxmlformats.org/markup-compatibility/2006" xmlns:o="urn:schemas-microsoft-com:office:office" xmlns:r="http://schemas.openxmlformats.org/officeDocument/2006/relationships" xmlns:m="http://schemas.openxmlformats.org/officeDocument/2006/math" xmlns:v="urn:schemas-microsoft-com:vml" xmlns:wp14="http://schemas.microsoft.com/office/word/2010/wordprocessingDrawing" xmlns:wp="http://schemas.openxmlformats.org/drawingml/2006/wordprocessingDrawing" xmlns:w10="urn:schemas-microsoft-com:office:word" xmlns:w="http://schemas.openxmlformats.org/wordprocessingml/2006/main" xmlns:w14="http://schemas.microsoft.com/office/word/2010/wordml" xmlns:w15="http://schemas.microsoft.com/office/word/2012/wordml" xmlns:w16se="http://schemas.microsoft.com/office/word/2015/wordml/symex" xmlns:wpg="http://schemas.microsoft.com/office/word/2010/wordprocessingGroup" xmlns:wpi="http://schemas.microsoft.com/office/word/2010/wordprocessingInk" xmlns:wne="http://schemas.microsoft.com/office/word/2006/wordml" xmlns:wps="http://schemas.microsoft.com/office/word/2010/wordprocessingShape" mc:Ignorable="w14 w15 w16se wp14">
+<w:footnotes xmlns:wpc="http://schemas.microsoft.com/office/word/2010/wordprocessingCanvas" xmlns:cx="http://schemas.microsoft.com/office/drawing/2014/chartex" xmlns:cx1="http://schemas.microsoft.com/office/drawing/2015/9/8/chartex" xmlns:cx2="http://schemas.microsoft.com/office/drawing/2015/10/21/chartex" xmlns:cx3="http://schemas.microsoft.com/office/drawing/2016/5/9/chartex" xmlns:cx4="http://schemas.microsoft.com/office/drawing/2016/5/10/chartex" xmlns:cx5="http://schemas.microsoft.com/office/drawing/2016/5/11/chartex" xmlns:cx6="http://schemas.microsoft.com/office/drawing/2016/5/12/chartex" xmlns:cx7="http://schemas.microsoft.com/office/drawing/2016/5/13/chartex" xmlns:cx8="http://schemas.microsoft.com/office/drawing/2016/5/14/chartex" xmlns:mc="http://schemas.openxmlformats.org/markup-compatibility/2006" xmlns:aink="http://schemas.microsoft.com/office/drawing/2016/ink" xmlns:am3d="http://schemas.microsoft.com/office/drawing/2017/model3d" xmlns:o="urn:schemas-microsoft-com:office:office" xmlns:r="http://schemas.openxmlformats.org/officeDocument/2006/relationships" xmlns:m="http://schemas.openxmlformats.org/officeDocument/2006/math" xmlns:v="urn:schemas-microsoft-com:vml" xmlns:wp14="http://schemas.microsoft.com/office/word/2010/wordprocessingDrawing" xmlns:wp="http://schemas.openxmlformats.org/drawingml/2006/wordprocessingDrawing" xmlns:w10="urn:schemas-microsoft-com:office:word" xmlns:w="http://schemas.openxmlformats.org/wordprocessingml/2006/main" xmlns:w14="http://schemas.microsoft.com/office/word/2010/wordml" xmlns:w15="http://schemas.microsoft.com/office/word/2012/wordml" xmlns:w16cex="http://schemas.microsoft.com/office/word/2018/wordml/cex" xmlns:w16cid="http://schemas.microsoft.com/office/word/2016/wordml/cid" xmlns:w16="http://schemas.microsoft.com/office/word/2018/wordml" xmlns:w16se="http://schemas.microsoft.com/office/word/2015/wordml/symex" xmlns:wpg="http://schemas.microsoft.com/office/word/2010/wordprocessingGroup" xmlns:wpi="http://schemas.microsoft.com/office/word/2010/wordprocessingInk" xmlns:wne="http://schemas.microsoft.com/office/word/2006/wordml" xmlns:wps="http://schemas.microsoft.com/office/word/2010/wordprocessingShape" mc:Ignorable="w14 w15 w16se w16cid w16 w16cex wp14">
   <w:footnote w:type="separator" w:id="-1">
     <w:p>
       <w:r>
@@ -48234,7 +47927,7 @@
 </file>
 
 <file path=word/numbering.xml><?xml version="1.0" encoding="utf-8"?>
-<w:numbering xmlns:wpc="http://schemas.microsoft.com/office/word/2010/wordprocessingCanvas" xmlns:cx="http://schemas.microsoft.com/office/drawing/2014/chartex" xmlns:mc="http://schemas.openxmlformats.org/markup-compatibility/2006" xmlns:o="urn:schemas-microsoft-com:office:office" xmlns:r="http://schemas.openxmlformats.org/officeDocument/2006/relationships" xmlns:m="http://schemas.openxmlformats.org/officeDocument/2006/math" xmlns:v="urn:schemas-microsoft-com:vml" xmlns:wp14="http://schemas.microsoft.com/office/word/2010/wordprocessingDrawing" xmlns:wp="http://schemas.openxmlformats.org/drawingml/2006/wordprocessingDrawing" xmlns:w10="urn:schemas-microsoft-com:office:word" xmlns:w="http://schemas.openxmlformats.org/wordprocessingml/2006/main" xmlns:w14="http://schemas.microsoft.com/office/word/2010/wordml" xmlns:w15="http://schemas.microsoft.com/office/word/2012/wordml" xmlns:w16se="http://schemas.microsoft.com/office/word/2015/wordml/symex" xmlns:wpg="http://schemas.microsoft.com/office/word/2010/wordprocessingGroup" xmlns:wpi="http://schemas.microsoft.com/office/word/2010/wordprocessingInk" xmlns:wne="http://schemas.microsoft.com/office/word/2006/wordml" xmlns:wps="http://schemas.microsoft.com/office/word/2010/wordprocessingShape" mc:Ignorable="w14 w15 w16se wp14">
+<w:numbering xmlns:wpc="http://schemas.microsoft.com/office/word/2010/wordprocessingCanvas" xmlns:cx="http://schemas.microsoft.com/office/drawing/2014/chartex" xmlns:cx1="http://schemas.microsoft.com/office/drawing/2015/9/8/chartex" xmlns:cx2="http://schemas.microsoft.com/office/drawing/2015/10/21/chartex" xmlns:cx3="http://schemas.microsoft.com/office/drawing/2016/5/9/chartex" xmlns:cx4="http://schemas.microsoft.com/office/drawing/2016/5/10/chartex" xmlns:cx5="http://schemas.microsoft.com/office/drawing/2016/5/11/chartex" xmlns:cx6="http://schemas.microsoft.com/office/drawing/2016/5/12/chartex" xmlns:cx7="http://schemas.microsoft.com/office/drawing/2016/5/13/chartex" xmlns:cx8="http://schemas.microsoft.com/office/drawing/2016/5/14/chartex" xmlns:mc="http://schemas.openxmlformats.org/markup-compatibility/2006" xmlns:aink="http://schemas.microsoft.com/office/drawing/2016/ink" xmlns:am3d="http://schemas.microsoft.com/office/drawing/2017/model3d" xmlns:o="urn:schemas-microsoft-com:office:office" xmlns:r="http://schemas.openxmlformats.org/officeDocument/2006/relationships" xmlns:m="http://schemas.openxmlformats.org/officeDocument/2006/math" xmlns:v="urn:schemas-microsoft-com:vml" xmlns:wp14="http://schemas.microsoft.com/office/word/2010/wordprocessingDrawing" xmlns:wp="http://schemas.openxmlformats.org/drawingml/2006/wordprocessingDrawing" xmlns:w10="urn:schemas-microsoft-com:office:word" xmlns:w="http://schemas.openxmlformats.org/wordprocessingml/2006/main" xmlns:w14="http://schemas.microsoft.com/office/word/2010/wordml" xmlns:w15="http://schemas.microsoft.com/office/word/2012/wordml" xmlns:w16cex="http://schemas.microsoft.com/office/word/2018/wordml/cex" xmlns:w16cid="http://schemas.microsoft.com/office/word/2016/wordml/cid" xmlns:w16="http://schemas.microsoft.com/office/word/2018/wordml" xmlns:w16se="http://schemas.microsoft.com/office/word/2015/wordml/symex" xmlns:wpg="http://schemas.microsoft.com/office/word/2010/wordprocessingGroup" xmlns:wpi="http://schemas.microsoft.com/office/word/2010/wordprocessingInk" xmlns:wne="http://schemas.microsoft.com/office/word/2006/wordml" xmlns:wps="http://schemas.microsoft.com/office/word/2010/wordprocessingShape" mc:Ignorable="w14 w15 w16se w16cid w16 w16cex wp14">
   <w:abstractNum w:abstractNumId="0" w15:restartNumberingAfterBreak="0">
     <w:nsid w:val="00055C12"/>
     <w:multiLevelType w:val="multilevel"/>
@@ -53508,7 +53201,7 @@
 </file>
 
 <file path=word/styles.xml><?xml version="1.0" encoding="utf-8"?>
-<w:styles xmlns:mc="http://schemas.openxmlformats.org/markup-compatibility/2006" xmlns:r="http://schemas.openxmlformats.org/officeDocument/2006/relationships" xmlns:w="http://schemas.openxmlformats.org/wordprocessingml/2006/main" xmlns:w14="http://schemas.microsoft.com/office/word/2010/wordml" xmlns:w15="http://schemas.microsoft.com/office/word/2012/wordml" xmlns:w16se="http://schemas.microsoft.com/office/word/2015/wordml/symex" mc:Ignorable="w14 w15 w16se">
+<w:styles xmlns:mc="http://schemas.openxmlformats.org/markup-compatibility/2006" xmlns:r="http://schemas.openxmlformats.org/officeDocument/2006/relationships" xmlns:w="http://schemas.openxmlformats.org/wordprocessingml/2006/main" xmlns:w14="http://schemas.microsoft.com/office/word/2010/wordml" xmlns:w15="http://schemas.microsoft.com/office/word/2012/wordml" xmlns:w16cex="http://schemas.microsoft.com/office/word/2018/wordml/cex" xmlns:w16cid="http://schemas.microsoft.com/office/word/2016/wordml/cid" xmlns:w16="http://schemas.microsoft.com/office/word/2018/wordml" xmlns:w16se="http://schemas.microsoft.com/office/word/2015/wordml/symex" mc:Ignorable="w14 w15 w16se w16cid w16 w16cex">
   <w:docDefaults>
     <w:rPrDefault>
       <w:rPr>
@@ -53526,7 +53219,7 @@
       </w:pPr>
     </w:pPrDefault>
   </w:docDefaults>
-  <w:latentStyles w:defLockedState="0" w:defUIPriority="99" w:defSemiHidden="0" w:defUnhideWhenUsed="0" w:defQFormat="0" w:count="371">
+  <w:latentStyles w:defLockedState="0" w:defUIPriority="99" w:defSemiHidden="0" w:defUnhideWhenUsed="0" w:defQFormat="0" w:count="376">
     <w:lsdException w:name="Normal" w:uiPriority="0" w:qFormat="1"/>
     <w:lsdException w:name="heading 1" w:uiPriority="9" w:qFormat="1"/>
     <w:lsdException w:name="heading 2" w:semiHidden="1" w:uiPriority="9" w:unhideWhenUsed="1" w:qFormat="1"/>
@@ -53898,6 +53591,11 @@
     <w:lsdException w:name="List Table 5 Dark Accent 6" w:uiPriority="50"/>
     <w:lsdException w:name="List Table 6 Colorful Accent 6" w:uiPriority="51"/>
     <w:lsdException w:name="List Table 7 Colorful Accent 6" w:uiPriority="52"/>
+    <w:lsdException w:name="Mention" w:semiHidden="1" w:unhideWhenUsed="1"/>
+    <w:lsdException w:name="Smart Hyperlink" w:semiHidden="1" w:unhideWhenUsed="1"/>
+    <w:lsdException w:name="Hashtag" w:semiHidden="1" w:unhideWhenUsed="1"/>
+    <w:lsdException w:name="Unresolved Mention" w:semiHidden="1" w:unhideWhenUsed="1"/>
+    <w:lsdException w:name="Smart Link" w:semiHidden="1" w:unhideWhenUsed="1"/>
   </w:latentStyles>
   <w:style w:type="paragraph" w:default="1" w:styleId="Normal">
     <w:name w:val="Normal"/>
@@ -54132,6 +53830,34 @@
     <w:rsid w:val="0071336D"/>
     <w:rPr>
       <w:rFonts w:ascii="Times New Roman" w:eastAsia="Times New Roman" w:hAnsi="Times New Roman" w:cs="Times New Roman"/>
+      <w:lang w:val="vi"/>
+    </w:rPr>
+  </w:style>
+  <w:style w:type="paragraph" w:styleId="BalloonText">
+    <w:name w:val="Balloon Text"/>
+    <w:basedOn w:val="Normal"/>
+    <w:link w:val="BalloonTextChar"/>
+    <w:uiPriority w:val="99"/>
+    <w:semiHidden/>
+    <w:unhideWhenUsed/>
+    <w:rsid w:val="00AC671D"/>
+    <w:rPr>
+      <w:rFonts w:ascii="Segoe UI" w:hAnsi="Segoe UI" w:cs="Segoe UI"/>
+      <w:sz w:val="18"/>
+      <w:szCs w:val="18"/>
+    </w:rPr>
+  </w:style>
+  <w:style w:type="character" w:customStyle="1" w:styleId="BalloonTextChar">
+    <w:name w:val="Balloon Text Char"/>
+    <w:basedOn w:val="DefaultParagraphFont"/>
+    <w:link w:val="BalloonText"/>
+    <w:uiPriority w:val="99"/>
+    <w:semiHidden/>
+    <w:rsid w:val="00AC671D"/>
+    <w:rPr>
+      <w:rFonts w:ascii="Segoe UI" w:eastAsia="Times New Roman" w:hAnsi="Segoe UI" w:cs="Segoe UI"/>
+      <w:sz w:val="18"/>
+      <w:szCs w:val="18"/>
       <w:lang w:val="vi"/>
     </w:rPr>
   </w:style>
@@ -54426,7 +54152,7 @@
 </file>
 
 <file path=customXml/itemProps1.xml><?xml version="1.0" encoding="utf-8"?>
-<ds:datastoreItem xmlns:ds="http://schemas.openxmlformats.org/officeDocument/2006/customXml" ds:itemID="{322866B7-3152-45DA-9386-78C84ADD7AA2}">
+<ds:datastoreItem xmlns:ds="http://schemas.openxmlformats.org/officeDocument/2006/customXml" ds:itemID="{320AE258-FCF7-4A1D-9011-41398F274BA0}">
   <ds:schemaRefs>
     <ds:schemaRef ds:uri="http://schemas.openxmlformats.org/officeDocument/2006/bibliography"/>
   </ds:schemaRefs>

</xml_diff>